<commit_message>
update fix ui, docs
</commit_message>
<xml_diff>
--- a/public/docs/dogovor-arendy.docx
+++ b/public/docs/dogovor-arendy.docx
@@ -1,6 +1,6 @@
 
 <file path=word/document.xml><?xml version="1.0" encoding="utf-8"?>
-<w:document xmlns:ve="http://schemas.openxmlformats.org/markup-compatibility/2006" xmlns:o="urn:schemas-microsoft-com:office:office" xmlns:r="http://schemas.openxmlformats.org/officeDocument/2006/relationships" xmlns:m="http://schemas.openxmlformats.org/officeDocument/2006/math" xmlns:v="urn:schemas-microsoft-com:vml" xmlns:wp="http://schemas.openxmlformats.org/drawingml/2006/wordprocessingDrawing" xmlns:w10="urn:schemas-microsoft-com:office:word" xmlns:w="http://schemas.openxmlformats.org/wordprocessingml/2006/main" xmlns:wne="http://schemas.microsoft.com/office/word/2006/wordml">
+<w:document xmlns:wpc="http://schemas.microsoft.com/office/word/2010/wordprocessingCanvas" xmlns:cx="http://schemas.microsoft.com/office/drawing/2014/chartex" xmlns:cx1="http://schemas.microsoft.com/office/drawing/2015/9/8/chartex" xmlns:mc="http://schemas.openxmlformats.org/markup-compatibility/2006" xmlns:o="urn:schemas-microsoft-com:office:office" xmlns:r="http://schemas.openxmlformats.org/officeDocument/2006/relationships" xmlns:m="http://schemas.openxmlformats.org/officeDocument/2006/math" xmlns:v="urn:schemas-microsoft-com:vml" xmlns:wp14="http://schemas.microsoft.com/office/word/2010/wordprocessingDrawing" xmlns:wp="http://schemas.openxmlformats.org/drawingml/2006/wordprocessingDrawing" xmlns:w10="urn:schemas-microsoft-com:office:word" xmlns:w="http://schemas.openxmlformats.org/wordprocessingml/2006/main" xmlns:w14="http://schemas.microsoft.com/office/word/2010/wordml" xmlns:w15="http://schemas.microsoft.com/office/word/2012/wordml" xmlns:w16se="http://schemas.microsoft.com/office/word/2015/wordml/symex" xmlns:wpg="http://schemas.microsoft.com/office/word/2010/wordprocessingGroup" xmlns:wpi="http://schemas.microsoft.com/office/word/2010/wordprocessingInk" xmlns:wne="http://schemas.microsoft.com/office/word/2006/wordml" xmlns:wps="http://schemas.microsoft.com/office/word/2010/wordprocessingShape" mc:Ignorable="w14 w15 w16se wp14">
   <w:body>
     <w:p>
       <w:pPr>
@@ -23,18 +23,18 @@
           <w:szCs w:val="16"/>
         </w:rPr>
         <w:drawing>
-          <wp:anchor distT="0" distB="0" distL="114300" distR="114300" simplePos="0" relativeHeight="251659776" behindDoc="0" locked="0" layoutInCell="1" allowOverlap="1">
+          <wp:anchor distT="0" distB="0" distL="114300" distR="114300" simplePos="0" relativeHeight="251658752" behindDoc="0" locked="0" layoutInCell="1" allowOverlap="1" wp14:anchorId="510DA7A8" wp14:editId="13E5B23F">
             <wp:simplePos x="0" y="0"/>
-            <wp:positionH relativeFrom="margin">
-              <wp:posOffset>4072890</wp:posOffset>
+            <wp:positionH relativeFrom="column">
+              <wp:posOffset>4752975</wp:posOffset>
             </wp:positionH>
             <wp:positionV relativeFrom="paragraph">
-              <wp:posOffset>-137160</wp:posOffset>
+              <wp:posOffset>107950</wp:posOffset>
             </wp:positionV>
-            <wp:extent cx="2487930" cy="701040"/>
+            <wp:extent cx="1894840" cy="454025"/>
             <wp:effectExtent l="0" t="0" r="0" b="0"/>
-            <wp:wrapSquare wrapText="left"/>
-            <wp:docPr id="3" name="Рисунок 3" descr="IMG_7439"/>
+            <wp:wrapSquare wrapText="bothSides"/>
+            <wp:docPr id="4" name="Рисунок 4" descr="C:\Users\Mikhail\AppData\Local\Microsoft\Windows\INetCache\Content.Word\4142_vector.png"/>
             <wp:cNvGraphicFramePr>
               <a:graphicFrameLocks xmlns:a="http://schemas.openxmlformats.org/drawingml/2006/main" noChangeAspect="1"/>
             </wp:cNvGraphicFramePr>
@@ -42,14 +42,20 @@
               <a:graphicData uri="http://schemas.openxmlformats.org/drawingml/2006/picture">
                 <pic:pic xmlns:pic="http://schemas.openxmlformats.org/drawingml/2006/picture">
                   <pic:nvPicPr>
-                    <pic:cNvPr id="0" name="Picture 3" descr="IMG_7439"/>
+                    <pic:cNvPr id="0" name="Picture 10" descr="C:\Users\Mikhail\AppData\Local\Microsoft\Windows\INetCache\Content.Word\4142_vector.png"/>
                     <pic:cNvPicPr>
                       <a:picLocks noChangeAspect="1" noChangeArrowheads="1"/>
                     </pic:cNvPicPr>
                   </pic:nvPicPr>
                   <pic:blipFill>
-                    <a:blip r:embed="rId8" cstate="print"/>
-                    <a:srcRect l="-2245" t="-16541" r="-2458" b="-21803"/>
+                    <a:blip r:embed="rId8" cstate="print">
+                      <a:extLst>
+                        <a:ext uri="{28A0092B-C50C-407E-A947-70E740481C1C}">
+                          <a14:useLocalDpi xmlns:a14="http://schemas.microsoft.com/office/drawing/2010/main" val="0"/>
+                        </a:ext>
+                      </a:extLst>
+                    </a:blip>
+                    <a:srcRect/>
                     <a:stretch>
                       <a:fillRect/>
                     </a:stretch>
@@ -57,21 +63,25 @@
                   <pic:spPr bwMode="auto">
                     <a:xfrm>
                       <a:off x="0" y="0"/>
-                      <a:ext cx="2487930" cy="701040"/>
+                      <a:ext cx="1894840" cy="454025"/>
                     </a:xfrm>
                     <a:prstGeom prst="rect">
                       <a:avLst/>
                     </a:prstGeom>
                     <a:noFill/>
-                    <a:ln w="9525">
-                      <a:miter lim="800000"/>
-                      <a:headEnd/>
-                      <a:tailEnd/>
+                    <a:ln>
+                      <a:noFill/>
                     </a:ln>
                   </pic:spPr>
                 </pic:pic>
               </a:graphicData>
             </a:graphic>
+            <wp14:sizeRelH relativeFrom="margin">
+              <wp14:pctWidth>0</wp14:pctWidth>
+            </wp14:sizeRelH>
+            <wp14:sizeRelV relativeFrom="margin">
+              <wp14:pctHeight>0</wp14:pctHeight>
+            </wp14:sizeRelV>
           </wp:anchor>
         </w:drawing>
       </w:r>
@@ -107,6 +117,16 @@
         </w:rPr>
         <w:t>НТАСИБ»</w:t>
       </w:r>
+      <w:r>
+        <w:rPr>
+          <w:noProof/>
+          <w:sz w:val="16"/>
+          <w:szCs w:val="16"/>
+        </w:rPr>
+        <w:t xml:space="preserve"> </w:t>
+      </w:r>
+      <w:bookmarkStart w:id="0" w:name="_GoBack"/>
+      <w:bookmarkEnd w:id="0"/>
     </w:p>
     <w:p>
       <w:pPr>
@@ -193,6 +213,7 @@
         <w:rPr>
           <w:rFonts w:asciiTheme="minorHAnsi" w:hAnsiTheme="minorHAnsi"/>
           <w:b/>
+          <w:lang w:val="en-US"/>
         </w:rPr>
       </w:pPr>
       <w:r>
@@ -244,11 +265,11 @@
           <w:insideH w:val="single" w:sz="4" w:space="0" w:color="auto"/>
           <w:insideV w:val="single" w:sz="4" w:space="0" w:color="auto"/>
         </w:tblBorders>
-        <w:tblLook w:val="04A0"/>
+        <w:tblLook w:val="04A0" w:firstRow="1" w:lastRow="0" w:firstColumn="1" w:lastColumn="0" w:noHBand="0" w:noVBand="1"/>
       </w:tblPr>
       <w:tblGrid>
-        <w:gridCol w:w="3827"/>
-        <w:gridCol w:w="6855"/>
+        <w:gridCol w:w="3762"/>
+        <w:gridCol w:w="6704"/>
       </w:tblGrid>
       <w:tr>
         <w:tc>
@@ -475,12 +496,12 @@
           <w:insideH w:val="single" w:sz="4" w:space="0" w:color="auto"/>
           <w:insideV w:val="single" w:sz="4" w:space="0" w:color="auto"/>
         </w:tblBorders>
-        <w:tblLook w:val="04A0"/>
+        <w:tblLook w:val="04A0" w:firstRow="1" w:lastRow="0" w:firstColumn="1" w:lastColumn="0" w:noHBand="0" w:noVBand="1"/>
       </w:tblPr>
       <w:tblGrid>
-        <w:gridCol w:w="3228"/>
-        <w:gridCol w:w="3332"/>
-        <w:gridCol w:w="4014"/>
+        <w:gridCol w:w="3158"/>
+        <w:gridCol w:w="3259"/>
+        <w:gridCol w:w="3931"/>
       </w:tblGrid>
       <w:tr>
         <w:tc>
@@ -773,7 +794,7 @@
           <w:insideH w:val="single" w:sz="4" w:space="0" w:color="auto"/>
           <w:insideV w:val="single" w:sz="4" w:space="0" w:color="auto"/>
         </w:tblBorders>
-        <w:tblLook w:val="0000"/>
+        <w:tblLook w:val="0000" w:firstRow="0" w:lastRow="0" w:firstColumn="0" w:lastColumn="0" w:noHBand="0" w:noVBand="0"/>
       </w:tblPr>
       <w:tblGrid>
         <w:gridCol w:w="4979"/>
@@ -1072,7 +1093,7 @@
           <w:sz w:val="18"/>
           <w:szCs w:val="18"/>
         </w:rPr>
-        <w:t>4</w:t>
+        <w:t>3</w:t>
       </w:r>
       <w:r>
         <w:rPr>
@@ -1340,11 +1361,11 @@
           <w:insideH w:val="single" w:sz="4" w:space="0" w:color="auto"/>
           <w:insideV w:val="single" w:sz="4" w:space="0" w:color="auto"/>
         </w:tblBorders>
-        <w:tblLook w:val="04A0"/>
+        <w:tblLook w:val="04A0" w:firstRow="1" w:lastRow="0" w:firstColumn="1" w:lastColumn="0" w:noHBand="0" w:noVBand="1"/>
       </w:tblPr>
       <w:tblGrid>
-        <w:gridCol w:w="4980"/>
-        <w:gridCol w:w="5594"/>
+        <w:gridCol w:w="4865"/>
+        <w:gridCol w:w="5483"/>
       </w:tblGrid>
       <w:tr>
         <w:tc>
@@ -1689,11 +1710,11 @@
           <w:insideH w:val="single" w:sz="4" w:space="0" w:color="auto"/>
           <w:insideV w:val="single" w:sz="4" w:space="0" w:color="auto"/>
         </w:tblBorders>
-        <w:tblLook w:val="04A0"/>
+        <w:tblLook w:val="04A0" w:firstRow="1" w:lastRow="0" w:firstColumn="1" w:lastColumn="0" w:noHBand="0" w:noVBand="1"/>
       </w:tblPr>
       <w:tblGrid>
-        <w:gridCol w:w="4993"/>
-        <w:gridCol w:w="5581"/>
+        <w:gridCol w:w="4892"/>
+        <w:gridCol w:w="5456"/>
       </w:tblGrid>
       <w:tr>
         <w:tc>
@@ -1826,7 +1847,7 @@
                 <w:sz w:val="18"/>
                 <w:szCs w:val="18"/>
               </w:rPr>
-              <w:t>0</w:t>
+              <w:t>5</w:t>
             </w:r>
             <w:r>
               <w:rPr>
@@ -2523,25 +2544,90 @@
           <w:sz w:val="18"/>
           <w:szCs w:val="18"/>
         </w:rPr>
-        <w:pict>
-          <v:shapetype id="_x0000_t94" coordsize="21600,21600" o:spt="94" adj="16200,5400" path="m@0,l@0@1,0@1@5,10800,0@2@0@2@0,21600,21600,10800xe">
-            <v:stroke joinstyle="miter"/>
-            <v:formulas>
-              <v:f eqn="val #0"/>
-              <v:f eqn="val #1"/>
-              <v:f eqn="sum height 0 #1"/>
-              <v:f eqn="sum 10800 0 #1"/>
-              <v:f eqn="sum width 0 #0"/>
-              <v:f eqn="prod @4 @3 10800"/>
-              <v:f eqn="sum width 0 @5"/>
-            </v:formulas>
-            <v:path o:connecttype="custom" o:connectlocs="@0,0;@5,10800;@0,21600;21600,10800" o:connectangles="270,180,90,0" textboxrect="@5,@1,@6,@2"/>
-            <v:handles>
-              <v:h position="#0,#1" xrange="0,21600" yrange="0,10800"/>
-            </v:handles>
-          </v:shapetype>
-          <v:shape id="_x0000_s1032" type="#_x0000_t94" style="position:absolute;left:0;text-align:left;margin-left:354.75pt;margin-top:22.05pt;width:29.25pt;height:7.15pt;z-index:251655680"/>
-        </w:pict>
+        <mc:AlternateContent>
+          <mc:Choice Requires="wps">
+            <w:drawing>
+              <wp:anchor distT="0" distB="0" distL="114300" distR="114300" simplePos="0" relativeHeight="251655680" behindDoc="0" locked="0" layoutInCell="1" allowOverlap="1">
+                <wp:simplePos x="0" y="0"/>
+                <wp:positionH relativeFrom="column">
+                  <wp:posOffset>4505325</wp:posOffset>
+                </wp:positionH>
+                <wp:positionV relativeFrom="paragraph">
+                  <wp:posOffset>280035</wp:posOffset>
+                </wp:positionV>
+                <wp:extent cx="371475" cy="90805"/>
+                <wp:effectExtent l="28575" t="16510" r="19050" b="16510"/>
+                <wp:wrapNone/>
+                <wp:docPr id="8" name="AutoShape 8"/>
+                <wp:cNvGraphicFramePr>
+                  <a:graphicFrameLocks xmlns:a="http://schemas.openxmlformats.org/drawingml/2006/main"/>
+                </wp:cNvGraphicFramePr>
+                <a:graphic xmlns:a="http://schemas.openxmlformats.org/drawingml/2006/main">
+                  <a:graphicData uri="http://schemas.microsoft.com/office/word/2010/wordprocessingShape">
+                    <wps:wsp>
+                      <wps:cNvSpPr>
+                        <a:spLocks noChangeArrowheads="1"/>
+                      </wps:cNvSpPr>
+                      <wps:spPr bwMode="auto">
+                        <a:xfrm>
+                          <a:off x="0" y="0"/>
+                          <a:ext cx="371475" cy="90805"/>
+                        </a:xfrm>
+                        <a:prstGeom prst="notchedRightArrow">
+                          <a:avLst>
+                            <a:gd name="adj1" fmla="val 50000"/>
+                            <a:gd name="adj2" fmla="val 102273"/>
+                          </a:avLst>
+                        </a:prstGeom>
+                        <a:solidFill>
+                          <a:srgbClr val="FFFFFF"/>
+                        </a:solidFill>
+                        <a:ln w="9525">
+                          <a:solidFill>
+                            <a:srgbClr val="000000"/>
+                          </a:solidFill>
+                          <a:miter lim="800000"/>
+                          <a:headEnd/>
+                          <a:tailEnd/>
+                        </a:ln>
+                      </wps:spPr>
+                      <wps:bodyPr rot="0" vert="horz" wrap="square" lIns="91440" tIns="45720" rIns="91440" bIns="45720" anchor="t" anchorCtr="0" upright="1">
+                        <a:noAutofit/>
+                      </wps:bodyPr>
+                    </wps:wsp>
+                  </a:graphicData>
+                </a:graphic>
+                <wp14:sizeRelH relativeFrom="page">
+                  <wp14:pctWidth>0</wp14:pctWidth>
+                </wp14:sizeRelH>
+                <wp14:sizeRelV relativeFrom="page">
+                  <wp14:pctHeight>0</wp14:pctHeight>
+                </wp14:sizeRelV>
+              </wp:anchor>
+            </w:drawing>
+          </mc:Choice>
+          <mc:Fallback>
+            <w:pict>
+              <v:shapetype w14:anchorId="45D741C9" id="_x0000_t94" coordsize="21600,21600" o:spt="94" adj="16200,5400" path="m@0,l@0@1,0@1@5,10800,0@2@0@2@0,21600,21600,10800xe">
+                <v:stroke joinstyle="miter"/>
+                <v:formulas>
+                  <v:f eqn="val #0"/>
+                  <v:f eqn="val #1"/>
+                  <v:f eqn="sum height 0 #1"/>
+                  <v:f eqn="sum 10800 0 #1"/>
+                  <v:f eqn="sum width 0 #0"/>
+                  <v:f eqn="prod @4 @3 10800"/>
+                  <v:f eqn="sum width 0 @5"/>
+                </v:formulas>
+                <v:path o:connecttype="custom" o:connectlocs="@0,0;@5,10800;@0,21600;21600,10800" o:connectangles="270,180,90,0" textboxrect="@5,@1,@6,@2"/>
+                <v:handles>
+                  <v:h position="#0,#1" xrange="0,21600" yrange="0,10800"/>
+                </v:handles>
+              </v:shapetype>
+              <v:shape id="AutoShape 8" o:spid="_x0000_s1026" type="#_x0000_t94" style="position:absolute;margin-left:354.75pt;margin-top:22.05pt;width:29.25pt;height:7.15pt;z-index:251655680;visibility:visible;mso-wrap-style:square;mso-width-percent:0;mso-height-percent:0;mso-wrap-distance-left:9pt;mso-wrap-distance-top:0;mso-wrap-distance-right:9pt;mso-wrap-distance-bottom:0;mso-position-horizontal:absolute;mso-position-horizontal-relative:text;mso-position-vertical:absolute;mso-position-vertical-relative:text;mso-width-percent:0;mso-height-percent:0;mso-width-relative:page;mso-height-relative:page;v-text-anchor:top" o:gfxdata="UEsDBBQABgAIAAAAIQC2gziS/gAAAOEBAAATAAAAW0NvbnRlbnRfVHlwZXNdLnhtbJSRQU7DMBBF&#10;90jcwfIWJU67QAgl6YK0S0CoHGBkTxKLZGx5TGhvj5O2G0SRWNoz/78nu9wcxkFMGNg6quQqL6RA&#10;0s5Y6ir5vt9lD1JwBDIwOMJKHpHlpr69KfdHjyxSmriSfYz+USnWPY7AufNIadK6MEJMx9ApD/oD&#10;OlTrorhX2lFEilmcO2RdNtjC5xDF9pCuTyYBB5bi6bQ4syoJ3g9WQ0ymaiLzg5KdCXlKLjvcW893&#10;SUOqXwnz5DrgnHtJTxOsQfEKIT7DmDSUCaxw7Rqn8787ZsmRM9e2VmPeBN4uqYvTtW7jvijg9N/y&#10;JsXecLq0q+WD6m8AAAD//wMAUEsDBBQABgAIAAAAIQA4/SH/1gAAAJQBAAALAAAAX3JlbHMvLnJl&#10;bHOkkMFqwzAMhu+DvYPRfXGawxijTi+j0GvpHsDYimMaW0Yy2fr2M4PBMnrbUb/Q94l/f/hMi1qR&#10;JVI2sOt6UJgd+ZiDgffL8ekFlFSbvV0oo4EbChzGx4f9GRdb25HMsYhqlCwG5lrLq9biZkxWOiqY&#10;22YiTra2kYMu1l1tQD30/bPm3wwYN0x18gb45AdQl1tp5j/sFB2T0FQ7R0nTNEV3j6o9feQzro1i&#10;OWA14Fm+Q8a1a8+Bvu/d/dMb2JY5uiPbhG/ktn4cqGU/er3pcvwCAAD//wMAUEsDBBQABgAIAAAA&#10;IQAfcYk5RQIAAJkEAAAOAAAAZHJzL2Uyb0RvYy54bWysVNtu2zAMfR+wfxD0vvrSZGmNOkXRrsOA&#10;XYp1+wBGkmNtuk1S4nRfP0p2M2d7G+YHQzSpw0Me0lfXB63IXvggrWlpdVZSIgyzXJptS79+uX91&#10;QUmIYDgoa0RLn0Sg1+uXL64G14ja9lZx4QmCmNAMrqV9jK4pisB6oSGcWScMOjvrNUQ0/bbgHgZE&#10;16qoy/J1MVjPnbdMhIBf70YnXWf8rhMsfuq6ICJRLUVuMb99fm/Su1hfQbP14HrJJhrwDyw0SINJ&#10;j1B3EIHsvPwLSkvmbbBdPGNWF7brJBO5BqymKv+o5rEHJ3It2Jzgjm0K/w+Wfdw/eCJ5S1EoAxol&#10;utlFmzOTi9SewYUGox7dg08FBvfesu+BGHvbg9mKG+/t0AvgSKpK8cXJhWQEvEo2wwfLER0QPXfq&#10;0HmdALEH5JAFeToKIg6RMPx4vqoWqyUlDF2X5UW5zAmgeb7rfIhvhdUkHVpqbMS54Z/lto+ZV04E&#10;+/chZm34VCHwbxUlnVYo9R4UWZb4TKMwi6nnMVVZ16vzKf8EWUDzzCC3xirJ76VS2fDbza3yBPFb&#10;ep+f6XKYhylDBqxtWS8z1xNfmEMkiiNJzHoSpmXEFVJSo4bHIGiSJm8MzwMeQarxjJeVmURKuoz6&#10;bix/Qo28HfcD9xkPvfU/KRlwN1oafuzAC0rUO4M6X1aLRVqmbCyWqxoNP/ds5h4wDKFaGikZj7dx&#10;XMCd80mpNDepY8amyetkfB6ikdVEFucfTycLNrdz1O8/yvoXAAAA//8DAFBLAwQUAAYACAAAACEA&#10;GHkjDN0AAAAJAQAADwAAAGRycy9kb3ducmV2LnhtbEyPwU7DMBBE70j8g7VI3KjTKk1NiFNBJbhT&#10;EBK3TbzEEfE6ip028PWYExxX+zTzptovbhAnmkLvWcN6lYEgbr3pudPw+vJ4o0CEiGxw8EwavijA&#10;vr68qLA0/szPdDrGTqQQDiVqsDGOpZShteQwrPxInH4ffnIY0zl10kx4TuFukJssK6TDnlODxZEO&#10;ltrP4+w0FBN+h/kJm27Db/P7QaoHaZXW11fL/R2ISEv8g+FXP6lDnZwaP7MJYtCwy263CdWQ52sQ&#10;CdgVKo1rNGxVDrKu5P8F9Q8AAAD//wMAUEsBAi0AFAAGAAgAAAAhALaDOJL+AAAA4QEAABMAAAAA&#10;AAAAAAAAAAAAAAAAAFtDb250ZW50X1R5cGVzXS54bWxQSwECLQAUAAYACAAAACEAOP0h/9YAAACU&#10;AQAACwAAAAAAAAAAAAAAAAAvAQAAX3JlbHMvLnJlbHNQSwECLQAUAAYACAAAACEAH3GJOUUCAACZ&#10;BAAADgAAAAAAAAAAAAAAAAAuAgAAZHJzL2Uyb0RvYy54bWxQSwECLQAUAAYACAAAACEAGHkjDN0A&#10;AAAJAQAADwAAAAAAAAAAAAAAAACfBAAAZHJzL2Rvd25yZXYueG1sUEsFBgAAAAAEAAQA8wAAAKkF&#10;AAAAAA==&#10;"/>
+            </w:pict>
+          </mc:Fallback>
+        </mc:AlternateContent>
       </w:r>
       <w:r>
         <w:rPr>
@@ -4762,9 +4848,74 @@
           <w:sz w:val="18"/>
           <w:szCs w:val="18"/>
         </w:rPr>
-        <w:pict>
-          <v:shape id="_x0000_s1033" type="#_x0000_t94" style="position:absolute;left:0;text-align:left;margin-left:343.2pt;margin-top:52.75pt;width:29.25pt;height:7.15pt;z-index:251656704"/>
-        </w:pict>
+        <mc:AlternateContent>
+          <mc:Choice Requires="wps">
+            <w:drawing>
+              <wp:anchor distT="0" distB="0" distL="114300" distR="114300" simplePos="0" relativeHeight="251656704" behindDoc="0" locked="0" layoutInCell="1" allowOverlap="1">
+                <wp:simplePos x="0" y="0"/>
+                <wp:positionH relativeFrom="column">
+                  <wp:posOffset>4358640</wp:posOffset>
+                </wp:positionH>
+                <wp:positionV relativeFrom="paragraph">
+                  <wp:posOffset>669925</wp:posOffset>
+                </wp:positionV>
+                <wp:extent cx="371475" cy="90805"/>
+                <wp:effectExtent l="34290" t="17780" r="22860" b="15240"/>
+                <wp:wrapNone/>
+                <wp:docPr id="7" name="AutoShape 9"/>
+                <wp:cNvGraphicFramePr>
+                  <a:graphicFrameLocks xmlns:a="http://schemas.openxmlformats.org/drawingml/2006/main"/>
+                </wp:cNvGraphicFramePr>
+                <a:graphic xmlns:a="http://schemas.openxmlformats.org/drawingml/2006/main">
+                  <a:graphicData uri="http://schemas.microsoft.com/office/word/2010/wordprocessingShape">
+                    <wps:wsp>
+                      <wps:cNvSpPr>
+                        <a:spLocks noChangeArrowheads="1"/>
+                      </wps:cNvSpPr>
+                      <wps:spPr bwMode="auto">
+                        <a:xfrm>
+                          <a:off x="0" y="0"/>
+                          <a:ext cx="371475" cy="90805"/>
+                        </a:xfrm>
+                        <a:prstGeom prst="notchedRightArrow">
+                          <a:avLst>
+                            <a:gd name="adj1" fmla="val 50000"/>
+                            <a:gd name="adj2" fmla="val 102273"/>
+                          </a:avLst>
+                        </a:prstGeom>
+                        <a:solidFill>
+                          <a:srgbClr val="FFFFFF"/>
+                        </a:solidFill>
+                        <a:ln w="9525">
+                          <a:solidFill>
+                            <a:srgbClr val="000000"/>
+                          </a:solidFill>
+                          <a:miter lim="800000"/>
+                          <a:headEnd/>
+                          <a:tailEnd/>
+                        </a:ln>
+                      </wps:spPr>
+                      <wps:bodyPr rot="0" vert="horz" wrap="square" lIns="91440" tIns="45720" rIns="91440" bIns="45720" anchor="t" anchorCtr="0" upright="1">
+                        <a:noAutofit/>
+                      </wps:bodyPr>
+                    </wps:wsp>
+                  </a:graphicData>
+                </a:graphic>
+                <wp14:sizeRelH relativeFrom="page">
+                  <wp14:pctWidth>0</wp14:pctWidth>
+                </wp14:sizeRelH>
+                <wp14:sizeRelV relativeFrom="page">
+                  <wp14:pctHeight>0</wp14:pctHeight>
+                </wp14:sizeRelV>
+              </wp:anchor>
+            </w:drawing>
+          </mc:Choice>
+          <mc:Fallback>
+            <w:pict>
+              <v:shape w14:anchorId="0BEB8D66" id="AutoShape 9" o:spid="_x0000_s1026" type="#_x0000_t94" style="position:absolute;margin-left:343.2pt;margin-top:52.75pt;width:29.25pt;height:7.15pt;z-index:251656704;visibility:visible;mso-wrap-style:square;mso-width-percent:0;mso-height-percent:0;mso-wrap-distance-left:9pt;mso-wrap-distance-top:0;mso-wrap-distance-right:9pt;mso-wrap-distance-bottom:0;mso-position-horizontal:absolute;mso-position-horizontal-relative:text;mso-position-vertical:absolute;mso-position-vertical-relative:text;mso-width-percent:0;mso-height-percent:0;mso-width-relative:page;mso-height-relative:page;v-text-anchor:top" o:gfxdata="UEsDBBQABgAIAAAAIQC2gziS/gAAAOEBAAATAAAAW0NvbnRlbnRfVHlwZXNdLnhtbJSRQU7DMBBF&#10;90jcwfIWJU67QAgl6YK0S0CoHGBkTxKLZGx5TGhvj5O2G0SRWNoz/78nu9wcxkFMGNg6quQqL6RA&#10;0s5Y6ir5vt9lD1JwBDIwOMJKHpHlpr69KfdHjyxSmriSfYz+USnWPY7AufNIadK6MEJMx9ApD/oD&#10;OlTrorhX2lFEilmcO2RdNtjC5xDF9pCuTyYBB5bi6bQ4syoJ3g9WQ0ymaiLzg5KdCXlKLjvcW893&#10;SUOqXwnz5DrgnHtJTxOsQfEKIT7DmDSUCaxw7Rqn8787ZsmRM9e2VmPeBN4uqYvTtW7jvijg9N/y&#10;JsXecLq0q+WD6m8AAAD//wMAUEsDBBQABgAIAAAAIQA4/SH/1gAAAJQBAAALAAAAX3JlbHMvLnJl&#10;bHOkkMFqwzAMhu+DvYPRfXGawxijTi+j0GvpHsDYimMaW0Yy2fr2M4PBMnrbUb/Q94l/f/hMi1qR&#10;JVI2sOt6UJgd+ZiDgffL8ekFlFSbvV0oo4EbChzGx4f9GRdb25HMsYhqlCwG5lrLq9biZkxWOiqY&#10;22YiTra2kYMu1l1tQD30/bPm3wwYN0x18gb45AdQl1tp5j/sFB2T0FQ7R0nTNEV3j6o9feQzro1i&#10;OWA14Fm+Q8a1a8+Bvu/d/dMb2JY5uiPbhG/ktn4cqGU/er3pcvwCAAD//wMAUEsDBBQABgAIAAAA&#10;IQAuMEfLRgIAAJkEAAAOAAAAZHJzL2Uyb0RvYy54bWysVNtu2zAMfR+wfxD0vvrSZGmNOkXRrsOA&#10;XYp1+wBGkmNtuk1S4nRfP0p2M2d7G+YHQzSpw0Me0lfXB63IXvggrWlpdVZSIgyzXJptS79+uX91&#10;QUmIYDgoa0RLn0Sg1+uXL64G14ja9lZx4QmCmNAMrqV9jK4pisB6oSGcWScMOjvrNUQ0/bbgHgZE&#10;16qoy/J1MVjPnbdMhIBf70YnXWf8rhMsfuq6ICJRLUVuMb99fm/Su1hfQbP14HrJJhrwDyw0SINJ&#10;j1B3EIHsvPwLSkvmbbBdPGNWF7brJBO5BqymKv+o5rEHJ3It2Jzgjm0K/w+Wfdw/eCJ5S1eUGNAo&#10;0c0u2pyZXKb2DC40GPXoHnwqMLj3ln0PxNjbHsxW3Hhvh14AR1JVii9OLiQj4FWyGT5YjuiA6LlT&#10;h87rBIg9IIcsyNNREHGIhOHH81W1WC0pYei6LC/KZU4AzfNd50N8K6wm6dBSYyPODf8st33MvHIi&#10;2L8PMWvDpwqBf6so6bRCqfegyLLEZxqFWUw9j6nKul6dT/knyAKaZwa5NVZJfi+Vyobfbm6VJ4jf&#10;0vv8TJfDPEwZMmBty3qZuZ74whwiURxJYtaTMC0jrpCSuqUXxyBokiZvDM8DHkGq8YyXlZlESrqM&#10;+m4sf0KNvB33A/cZD731PykZcDdaGn7swAtK1DuDOl9Wi0VapmwslqsaDT/3bOYeMAyhWhopGY+3&#10;cVzAnfNJqTQ3qWPGpsnrZHweopHVRBbnH08nCza3c9TvP8r6FwAAAP//AwBQSwMEFAAGAAgAAAAh&#10;AHmsbE3dAAAACwEAAA8AAABkcnMvZG93bnJldi54bWxMj8FOwzAMhu9IvENkJG4s3dSVrDSdYBLc&#10;GQiJm9uEpqJxqibdCk+POcHR/n99/lztFz+Ik51iH0jDepWBsNQG01On4fXl8UaBiAnJ4BDIaviy&#10;Efb15UWFpQlneranY+oEQyiWqMGlNJZSxtZZj3EVRkucfYTJY+Jx6qSZ8MxwP8hNlhXSY098weFo&#10;D862n8fZaygm/I7zEzbdht7m94NUD9Ipra+vlvs7EMku6a8Mv/qsDjU7NWEmE8XADFXkXOUg225B&#10;cOM2z3cgGt6sdwpkXcn/P9Q/AAAA//8DAFBLAQItABQABgAIAAAAIQC2gziS/gAAAOEBAAATAAAA&#10;AAAAAAAAAAAAAAAAAABbQ29udGVudF9UeXBlc10ueG1sUEsBAi0AFAAGAAgAAAAhADj9If/WAAAA&#10;lAEAAAsAAAAAAAAAAAAAAAAALwEAAF9yZWxzLy5yZWxzUEsBAi0AFAAGAAgAAAAhAC4wR8tGAgAA&#10;mQQAAA4AAAAAAAAAAAAAAAAALgIAAGRycy9lMm9Eb2MueG1sUEsBAi0AFAAGAAgAAAAhAHmsbE3d&#10;AAAACwEAAA8AAAAAAAAAAAAAAAAAoAQAAGRycy9kb3ducmV2LnhtbFBLBQYAAAAABAAEAPMAAACq&#10;BQAAAAA=&#10;"/>
+            </w:pict>
+          </mc:Fallback>
+        </mc:AlternateContent>
       </w:r>
       <w:r>
         <w:rPr>
@@ -4857,7 +5008,6 @@
           <w:sz w:val="18"/>
           <w:szCs w:val="18"/>
         </w:rPr>
-        <w:lastRenderedPageBreak/>
         <w:t xml:space="preserve">4.8. </w:t>
       </w:r>
       <w:r>
@@ -4926,7 +5076,12 @@
           <w:szCs w:val="18"/>
         </w:rPr>
         <w:sectPr>
-          <w:footerReference w:type="default" r:id="rId9"/>
+          <w:headerReference w:type="even" r:id="rId9"/>
+          <w:headerReference w:type="default" r:id="rId10"/>
+          <w:footerReference w:type="even" r:id="rId11"/>
+          <w:footerReference w:type="default" r:id="rId12"/>
+          <w:headerReference w:type="first" r:id="rId13"/>
+          <w:footerReference w:type="first" r:id="rId14"/>
           <w:type w:val="continuous"/>
           <w:pgSz w:w="11906" w:h="16838"/>
           <w:pgMar w:top="720" w:right="720" w:bottom="720" w:left="720" w:header="284" w:footer="709" w:gutter="0"/>
@@ -5815,11 +5970,11 @@
           <w:insideH w:val="single" w:sz="4" w:space="0" w:color="auto"/>
           <w:insideV w:val="single" w:sz="4" w:space="0" w:color="auto"/>
         </w:tblBorders>
-        <w:tblLook w:val="01E0"/>
+        <w:tblLook w:val="01E0" w:firstRow="1" w:lastRow="1" w:firstColumn="1" w:lastColumn="1" w:noHBand="0" w:noVBand="0"/>
       </w:tblPr>
       <w:tblGrid>
-        <w:gridCol w:w="5400"/>
-        <w:gridCol w:w="5282"/>
+        <w:gridCol w:w="5293"/>
+        <w:gridCol w:w="5163"/>
       </w:tblGrid>
       <w:tr>
         <w:tc>
@@ -6304,7 +6459,7 @@
         </w:tabs>
         <w:jc w:val="both"/>
         <w:sectPr>
-          <w:footerReference w:type="default" r:id="rId10"/>
+          <w:footerReference w:type="default" r:id="rId15"/>
           <w:type w:val="continuous"/>
           <w:pgSz w:w="11906" w:h="16838"/>
           <w:pgMar w:top="720" w:right="720" w:bottom="720" w:left="720" w:header="283" w:footer="709" w:gutter="0"/>
@@ -6360,11 +6515,11 @@
     <w:tbl>
       <w:tblPr>
         <w:tblW w:w="0" w:type="auto"/>
-        <w:tblLook w:val="01E0"/>
+        <w:tblLook w:val="01E0" w:firstRow="1" w:lastRow="1" w:firstColumn="1" w:lastColumn="1" w:noHBand="0" w:noVBand="0"/>
       </w:tblPr>
       <w:tblGrid>
-        <w:gridCol w:w="5392"/>
-        <w:gridCol w:w="5290"/>
+        <w:gridCol w:w="5281"/>
+        <w:gridCol w:w="5185"/>
       </w:tblGrid>
       <w:tr>
         <w:trPr>
@@ -6418,9 +6573,74 @@
                 <w:sz w:val="18"/>
                 <w:szCs w:val="18"/>
               </w:rPr>
-              <w:pict>
-                <v:shape id="_x0000_s1034" type="#_x0000_t94" style="position:absolute;left:0;text-align:left;margin-left:63.25pt;margin-top:18.25pt;width:29.25pt;height:7.15pt;z-index:251657728;mso-position-horizontal-relative:text;mso-position-vertical-relative:text"/>
-              </w:pict>
+              <mc:AlternateContent>
+                <mc:Choice Requires="wps">
+                  <w:drawing>
+                    <wp:anchor distT="0" distB="0" distL="114300" distR="114300" simplePos="0" relativeHeight="251657728" behindDoc="0" locked="0" layoutInCell="1" allowOverlap="1">
+                      <wp:simplePos x="0" y="0"/>
+                      <wp:positionH relativeFrom="column">
+                        <wp:posOffset>803275</wp:posOffset>
+                      </wp:positionH>
+                      <wp:positionV relativeFrom="paragraph">
+                        <wp:posOffset>231775</wp:posOffset>
+                      </wp:positionV>
+                      <wp:extent cx="371475" cy="90805"/>
+                      <wp:effectExtent l="26670" t="15875" r="20955" b="17145"/>
+                      <wp:wrapNone/>
+                      <wp:docPr id="6" name="AutoShape 10"/>
+                      <wp:cNvGraphicFramePr>
+                        <a:graphicFrameLocks xmlns:a="http://schemas.openxmlformats.org/drawingml/2006/main"/>
+                      </wp:cNvGraphicFramePr>
+                      <a:graphic xmlns:a="http://schemas.openxmlformats.org/drawingml/2006/main">
+                        <a:graphicData uri="http://schemas.microsoft.com/office/word/2010/wordprocessingShape">
+                          <wps:wsp>
+                            <wps:cNvSpPr>
+                              <a:spLocks noChangeArrowheads="1"/>
+                            </wps:cNvSpPr>
+                            <wps:spPr bwMode="auto">
+                              <a:xfrm>
+                                <a:off x="0" y="0"/>
+                                <a:ext cx="371475" cy="90805"/>
+                              </a:xfrm>
+                              <a:prstGeom prst="notchedRightArrow">
+                                <a:avLst>
+                                  <a:gd name="adj1" fmla="val 50000"/>
+                                  <a:gd name="adj2" fmla="val 102273"/>
+                                </a:avLst>
+                              </a:prstGeom>
+                              <a:solidFill>
+                                <a:srgbClr val="FFFFFF"/>
+                              </a:solidFill>
+                              <a:ln w="9525">
+                                <a:solidFill>
+                                  <a:srgbClr val="000000"/>
+                                </a:solidFill>
+                                <a:miter lim="800000"/>
+                                <a:headEnd/>
+                                <a:tailEnd/>
+                              </a:ln>
+                            </wps:spPr>
+                            <wps:bodyPr rot="0" vert="horz" wrap="square" lIns="91440" tIns="45720" rIns="91440" bIns="45720" anchor="t" anchorCtr="0" upright="1">
+                              <a:noAutofit/>
+                            </wps:bodyPr>
+                          </wps:wsp>
+                        </a:graphicData>
+                      </a:graphic>
+                      <wp14:sizeRelH relativeFrom="page">
+                        <wp14:pctWidth>0</wp14:pctWidth>
+                      </wp14:sizeRelH>
+                      <wp14:sizeRelV relativeFrom="page">
+                        <wp14:pctHeight>0</wp14:pctHeight>
+                      </wp14:sizeRelV>
+                    </wp:anchor>
+                  </w:drawing>
+                </mc:Choice>
+                <mc:Fallback>
+                  <w:pict>
+                    <v:shape w14:anchorId="7B495094" id="AutoShape 10" o:spid="_x0000_s1026" type="#_x0000_t94" style="position:absolute;margin-left:63.25pt;margin-top:18.25pt;width:29.25pt;height:7.15pt;z-index:251657728;visibility:visible;mso-wrap-style:square;mso-width-percent:0;mso-height-percent:0;mso-wrap-distance-left:9pt;mso-wrap-distance-top:0;mso-wrap-distance-right:9pt;mso-wrap-distance-bottom:0;mso-position-horizontal:absolute;mso-position-horizontal-relative:text;mso-position-vertical:absolute;mso-position-vertical-relative:text;mso-width-percent:0;mso-height-percent:0;mso-width-relative:page;mso-height-relative:page;v-text-anchor:top" o:gfxdata="UEsDBBQABgAIAAAAIQC2gziS/gAAAOEBAAATAAAAW0NvbnRlbnRfVHlwZXNdLnhtbJSRQU7DMBBF&#10;90jcwfIWJU67QAgl6YK0S0CoHGBkTxKLZGx5TGhvj5O2G0SRWNoz/78nu9wcxkFMGNg6quQqL6RA&#10;0s5Y6ir5vt9lD1JwBDIwOMJKHpHlpr69KfdHjyxSmriSfYz+USnWPY7AufNIadK6MEJMx9ApD/oD&#10;OlTrorhX2lFEilmcO2RdNtjC5xDF9pCuTyYBB5bi6bQ4syoJ3g9WQ0ymaiLzg5KdCXlKLjvcW893&#10;SUOqXwnz5DrgnHtJTxOsQfEKIT7DmDSUCaxw7Rqn8787ZsmRM9e2VmPeBN4uqYvTtW7jvijg9N/y&#10;JsXecLq0q+WD6m8AAAD//wMAUEsDBBQABgAIAAAAIQA4/SH/1gAAAJQBAAALAAAAX3JlbHMvLnJl&#10;bHOkkMFqwzAMhu+DvYPRfXGawxijTi+j0GvpHsDYimMaW0Yy2fr2M4PBMnrbUb/Q94l/f/hMi1qR&#10;JVI2sOt6UJgd+ZiDgffL8ekFlFSbvV0oo4EbChzGx4f9GRdb25HMsYhqlCwG5lrLq9biZkxWOiqY&#10;22YiTra2kYMu1l1tQD30/bPm3wwYN0x18gb45AdQl1tp5j/sFB2T0FQ7R0nTNEV3j6o9feQzro1i&#10;OWA14Fm+Q8a1a8+Bvu/d/dMb2JY5uiPbhG/ktn4cqGU/er3pcvwCAAD//wMAUEsDBBQABgAIAAAA&#10;IQBYF9vcRwIAAJoEAAAOAAAAZHJzL2Uyb0RvYy54bWysVNuO0zAQfUfiHyy/01y23XajpqtVlyKk&#10;BVYsfIBrO43BN2y3afl6xk5aUnhD5CHyZMZnzsyZyfL+qCQ6cOeF0TUuJjlGXFPDhN7V+OuXzZsF&#10;Rj4QzYg0mtf4xD2+X71+texsxUvTGsm4QwCifdXZGrch2CrLPG25In5iLNfgbIxTJIDpdhlzpAN0&#10;JbMyz2+zzjhmnaHce/j62DvxKuE3DafhU9N4HpCsMXAL6e3Sexvf2WpJqp0jthV0oEH+gYUiQkPS&#10;C9QjCQTtnfgLSgnqjDdNmFCjMtM0gvJUA1RT5H9U89ISy1Mt0BxvL23y/w+Wfjw8OyRYjW8x0kSB&#10;RA/7YFJmVKT+dNZXEPZin12s0NsnQ797pM26JXrHH5wzXcsJA1ZF7Gd2dSEaHq6ibffBMIAnAJ9a&#10;dWycioDQBHRMipwuivBjQBQ+3syL6XyGEQXXXb7IZykBqc53rfPhHTcKxUONtQkwOOyz2LUh8UqJ&#10;yOHJhyQOG0ok7FuBUaMkaH0gEs1yeIZZGMWU45giL8v5zZB/gMxIdWaQWmOkYBshZTLcbruWDgF+&#10;jTfpGS77cZjUqIPaZuUscb3y+TFEpNiThKxXYUoE2CEpVI0XlyBSRU3eapYmPBAh+zNclnoQKeoS&#10;N8VXW8NOoJEz/YLAQsOhNe4nRh0sR439jz1xHCP5XoPOd8V0GrcpGdPZvATDjT3bsYdoClA1Dhj1&#10;x3XoN3BvXVQqzk3smDZx9BoRzkPUsxrIwgLA6WrDxnaK+v1LWf0CAAD//wMAUEsDBBQABgAIAAAA&#10;IQB7Aoiq2QAAAAkBAAAPAAAAZHJzL2Rvd25yZXYueG1sTI9NS8QwEIbvgv8hjODNTa20hNp00QW9&#10;u4rgbdqMTbGZlCbdrf5605Oehpd5eD/q/epGcaI5DJ413O4yEMSdNwP3Gt5en24UiBCRDY6eScM3&#10;Bdg3lxc1Vsaf+YVOx9iLZMKhQg02xqmSMnSWHIadn4jT79PPDmOScy/NjOdk7kaZZ1kpHQ6cEixO&#10;dLDUfR0Xp6Gc8Scsz9j2Ob8vHwepHqVVWl9frQ/3ICKt8Q+GrX6qDk3q1PqFTRBj0nlZJFTD3XY3&#10;QBVpXKuhyBTIppb/FzS/AAAA//8DAFBLAQItABQABgAIAAAAIQC2gziS/gAAAOEBAAATAAAAAAAA&#10;AAAAAAAAAAAAAABbQ29udGVudF9UeXBlc10ueG1sUEsBAi0AFAAGAAgAAAAhADj9If/WAAAAlAEA&#10;AAsAAAAAAAAAAAAAAAAALwEAAF9yZWxzLy5yZWxzUEsBAi0AFAAGAAgAAAAhAFgX29xHAgAAmgQA&#10;AA4AAAAAAAAAAAAAAAAALgIAAGRycy9lMm9Eb2MueG1sUEsBAi0AFAAGAAgAAAAhAHsCiKrZAAAA&#10;CQEAAA8AAAAAAAAAAAAAAAAAoQQAAGRycy9kb3ducmV2LnhtbFBLBQYAAAAABAAEAPMAAACnBQAA&#10;AAA=&#10;"/>
+                  </w:pict>
+                </mc:Fallback>
+              </mc:AlternateContent>
             </w:r>
             <w:r>
               <w:rPr>
@@ -6651,7 +6871,7 @@
           <w:insideV w:val="single" w:sz="4" w:space="0" w:color="auto"/>
         </w:tblBorders>
         <w:tblLayout w:type="fixed"/>
-        <w:tblLook w:val="01E0"/>
+        <w:tblLook w:val="01E0" w:firstRow="1" w:lastRow="1" w:firstColumn="1" w:lastColumn="1" w:noHBand="0" w:noVBand="0"/>
       </w:tblPr>
       <w:tblGrid>
         <w:gridCol w:w="1728"/>
@@ -7643,7 +7863,7 @@
                     </pic:cNvPicPr>
                   </pic:nvPicPr>
                   <pic:blipFill>
-                    <a:blip r:embed="rId11" cstate="print"/>
+                    <a:blip r:embed="rId16" cstate="print"/>
                     <a:srcRect/>
                     <a:stretch>
                       <a:fillRect/>
@@ -7728,9 +7948,74 @@
         <w:rPr>
           <w:noProof/>
         </w:rPr>
-        <w:pict>
-          <v:shape id="_x0000_s1035" type="#_x0000_t94" style="position:absolute;margin-left:286.65pt;margin-top:3.95pt;width:29.25pt;height:7.15pt;z-index:251658752"/>
-        </w:pict>
+        <mc:AlternateContent>
+          <mc:Choice Requires="wps">
+            <w:drawing>
+              <wp:anchor distT="0" distB="0" distL="114300" distR="114300" simplePos="0" relativeHeight="251658752" behindDoc="0" locked="0" layoutInCell="1" allowOverlap="1">
+                <wp:simplePos x="0" y="0"/>
+                <wp:positionH relativeFrom="column">
+                  <wp:posOffset>3640455</wp:posOffset>
+                </wp:positionH>
+                <wp:positionV relativeFrom="paragraph">
+                  <wp:posOffset>50165</wp:posOffset>
+                </wp:positionV>
+                <wp:extent cx="371475" cy="90805"/>
+                <wp:effectExtent l="30480" t="17145" r="17145" b="15875"/>
+                <wp:wrapNone/>
+                <wp:docPr id="5" name="AutoShape 11"/>
+                <wp:cNvGraphicFramePr>
+                  <a:graphicFrameLocks xmlns:a="http://schemas.openxmlformats.org/drawingml/2006/main"/>
+                </wp:cNvGraphicFramePr>
+                <a:graphic xmlns:a="http://schemas.openxmlformats.org/drawingml/2006/main">
+                  <a:graphicData uri="http://schemas.microsoft.com/office/word/2010/wordprocessingShape">
+                    <wps:wsp>
+                      <wps:cNvSpPr>
+                        <a:spLocks noChangeArrowheads="1"/>
+                      </wps:cNvSpPr>
+                      <wps:spPr bwMode="auto">
+                        <a:xfrm>
+                          <a:off x="0" y="0"/>
+                          <a:ext cx="371475" cy="90805"/>
+                        </a:xfrm>
+                        <a:prstGeom prst="notchedRightArrow">
+                          <a:avLst>
+                            <a:gd name="adj1" fmla="val 50000"/>
+                            <a:gd name="adj2" fmla="val 102273"/>
+                          </a:avLst>
+                        </a:prstGeom>
+                        <a:solidFill>
+                          <a:srgbClr val="FFFFFF"/>
+                        </a:solidFill>
+                        <a:ln w="9525">
+                          <a:solidFill>
+                            <a:srgbClr val="000000"/>
+                          </a:solidFill>
+                          <a:miter lim="800000"/>
+                          <a:headEnd/>
+                          <a:tailEnd/>
+                        </a:ln>
+                      </wps:spPr>
+                      <wps:bodyPr rot="0" vert="horz" wrap="square" lIns="91440" tIns="45720" rIns="91440" bIns="45720" anchor="t" anchorCtr="0" upright="1">
+                        <a:noAutofit/>
+                      </wps:bodyPr>
+                    </wps:wsp>
+                  </a:graphicData>
+                </a:graphic>
+                <wp14:sizeRelH relativeFrom="page">
+                  <wp14:pctWidth>0</wp14:pctWidth>
+                </wp14:sizeRelH>
+                <wp14:sizeRelV relativeFrom="page">
+                  <wp14:pctHeight>0</wp14:pctHeight>
+                </wp14:sizeRelV>
+              </wp:anchor>
+            </w:drawing>
+          </mc:Choice>
+          <mc:Fallback>
+            <w:pict>
+              <v:shape w14:anchorId="31F9B9D5" id="AutoShape 11" o:spid="_x0000_s1026" type="#_x0000_t94" style="position:absolute;margin-left:286.65pt;margin-top:3.95pt;width:29.25pt;height:7.15pt;z-index:251658752;visibility:visible;mso-wrap-style:square;mso-width-percent:0;mso-height-percent:0;mso-wrap-distance-left:9pt;mso-wrap-distance-top:0;mso-wrap-distance-right:9pt;mso-wrap-distance-bottom:0;mso-position-horizontal:absolute;mso-position-horizontal-relative:text;mso-position-vertical:absolute;mso-position-vertical-relative:text;mso-width-percent:0;mso-height-percent:0;mso-width-relative:page;mso-height-relative:page;v-text-anchor:top" o:gfxdata="UEsDBBQABgAIAAAAIQC2gziS/gAAAOEBAAATAAAAW0NvbnRlbnRfVHlwZXNdLnhtbJSRQU7DMBBF&#10;90jcwfIWJU67QAgl6YK0S0CoHGBkTxKLZGx5TGhvj5O2G0SRWNoz/78nu9wcxkFMGNg6quQqL6RA&#10;0s5Y6ir5vt9lD1JwBDIwOMJKHpHlpr69KfdHjyxSmriSfYz+USnWPY7AufNIadK6MEJMx9ApD/oD&#10;OlTrorhX2lFEilmcO2RdNtjC5xDF9pCuTyYBB5bi6bQ4syoJ3g9WQ0ymaiLzg5KdCXlKLjvcW893&#10;SUOqXwnz5DrgnHtJTxOsQfEKIT7DmDSUCaxw7Rqn8787ZsmRM9e2VmPeBN4uqYvTtW7jvijg9N/y&#10;JsXecLq0q+WD6m8AAAD//wMAUEsDBBQABgAIAAAAIQA4/SH/1gAAAJQBAAALAAAAX3JlbHMvLnJl&#10;bHOkkMFqwzAMhu+DvYPRfXGawxijTi+j0GvpHsDYimMaW0Yy2fr2M4PBMnrbUb/Q94l/f/hMi1qR&#10;JVI2sOt6UJgd+ZiDgffL8ekFlFSbvV0oo4EbChzGx4f9GRdb25HMsYhqlCwG5lrLq9biZkxWOiqY&#10;22YiTra2kYMu1l1tQD30/bPm3wwYN0x18gb45AdQl1tp5j/sFB2T0FQ7R0nTNEV3j6o9feQzro1i&#10;OWA14Fm+Q8a1a8+Bvu/d/dMb2JY5uiPbhG/ktn4cqGU/er3pcvwCAAD//wMAUEsDBBQABgAIAAAA&#10;IQDylD6dSQIAAJoEAAAOAAAAZHJzL2Uyb0RvYy54bWysVNtu1DAQfUfiHyy/01y6y7ZRs1XVUoRU&#10;oKLwAV7b2Rhsj7G9m22/nrGTLim8IfJgeTwzx2fmeHJxeTCa7KUPCmxLq5OSEmk5CGW3Lf329fbN&#10;GSUhMiuYBitb+igDvVy/fnUxuEbW0IMW0hMEsaEZXEv7GF1TFIH30rBwAk5adHbgDYto+m0hPBsQ&#10;3eiiLsu3xQBeOA9choCnN6OTrjN+10keP3ddkJHoliK3mFef101ai/UFa7aeuV7xiQb7BxaGKYuX&#10;HqFuWGRk59VfUEZxDwG6eMLBFNB1istcA1ZTlX9U89AzJ3Mt2Jzgjm0K/w+Wf9rfe6JES5eUWGZQ&#10;oqtdhHwzqarUn8GFBsMe3L1PFQZ3B/xHIBaue2a38sp7GHrJBLLK8cWLhGQETCWb4SMIhGcIn1t1&#10;6LxJgNgEcsiKPB4VkYdIOB6erqrFCplxdJ2XZ+UyESpY85zrfIjvJRiSNi21EPHhiC9q28fMK1/E&#10;9nchZnHEVCIT3ytKOqNR6z3TZFniN72FWUw9j6nKul6dTvdPkMjkmUFuDWglbpXW2fDbzbX2BPFb&#10;epu/KTnMw7QlA9a2rJeZ6wtfmEMkiiNJvPVFmFERZ0gr09KzYxBrkibvrMgvPDKlxz0ma4s9fNZl&#10;1HcD4hE18jAOCA40bnrwT5QMOBwtDT93zEtK9AeLOp9Xi0WapmwslqsaDT/3bOYeZjlCtTRSMm6v&#10;4ziBO+eTUundpI5ZSE+vUzFpnPiNrCYDByBLPw1rmrC5naN+/1LWvwAAAP//AwBQSwMEFAAGAAgA&#10;AAAhAJzLWuDcAAAACAEAAA8AAABkcnMvZG93bnJldi54bWxMj8FOwzAQRO9I/IO1SNyoU0ekIY1T&#10;QSW40yIkbpvYjSPidWQ7beDrMSc4jmY086beLXZkZ+3D4EjCepUB09Q5NVAv4e34fFcCCxFJ4ehI&#10;S/jSAXbN9VWNlXIXetXnQ+xZKqFQoQQT41RxHjqjLYaVmzQl7+S8xZik77nyeEnlduQiywpucaC0&#10;YHDSe6O7z8NsJRQev8P8gm0v6H3+2PPyiZtSytub5XELLOol/oXhFz+hQ5OYWjeTCmyUcL/J8xSV&#10;sHkAlvwiX6crrQQhBPCm5v8PND8AAAD//wMAUEsBAi0AFAAGAAgAAAAhALaDOJL+AAAA4QEAABMA&#10;AAAAAAAAAAAAAAAAAAAAAFtDb250ZW50X1R5cGVzXS54bWxQSwECLQAUAAYACAAAACEAOP0h/9YA&#10;AACUAQAACwAAAAAAAAAAAAAAAAAvAQAAX3JlbHMvLnJlbHNQSwECLQAUAAYACAAAACEA8pQ+nUkC&#10;AACaBAAADgAAAAAAAAAAAAAAAAAuAgAAZHJzL2Uyb0RvYy54bWxQSwECLQAUAAYACAAAACEAnMta&#10;4NwAAAAIAQAADwAAAAAAAAAAAAAAAACjBAAAZHJzL2Rvd25yZXYueG1sUEsFBgAAAAAEAAQA8wAA&#10;AKwFAAAAAA==&#10;"/>
+            </w:pict>
+          </mc:Fallback>
+        </mc:AlternateContent>
       </w:r>
       <w:r>
         <w:t>________</w:t>
@@ -8110,15 +8395,15 @@
 </file>
 
 <file path=word/endnotes.xml><?xml version="1.0" encoding="utf-8"?>
-<w:endnotes xmlns:ve="http://schemas.openxmlformats.org/markup-compatibility/2006" xmlns:o="urn:schemas-microsoft-com:office:office" xmlns:r="http://schemas.openxmlformats.org/officeDocument/2006/relationships" xmlns:m="http://schemas.openxmlformats.org/officeDocument/2006/math" xmlns:v="urn:schemas-microsoft-com:vml" xmlns:wp="http://schemas.openxmlformats.org/drawingml/2006/wordprocessingDrawing" xmlns:w10="urn:schemas-microsoft-com:office:word" xmlns:w="http://schemas.openxmlformats.org/wordprocessingml/2006/main" xmlns:wne="http://schemas.microsoft.com/office/word/2006/wordml">
-  <w:endnote w:type="separator" w:id="0">
+<w:endnotes xmlns:wpc="http://schemas.microsoft.com/office/word/2010/wordprocessingCanvas" xmlns:cx="http://schemas.microsoft.com/office/drawing/2014/chartex" xmlns:cx1="http://schemas.microsoft.com/office/drawing/2015/9/8/chartex" xmlns:mc="http://schemas.openxmlformats.org/markup-compatibility/2006" xmlns:o="urn:schemas-microsoft-com:office:office" xmlns:r="http://schemas.openxmlformats.org/officeDocument/2006/relationships" xmlns:m="http://schemas.openxmlformats.org/officeDocument/2006/math" xmlns:v="urn:schemas-microsoft-com:vml" xmlns:wp14="http://schemas.microsoft.com/office/word/2010/wordprocessingDrawing" xmlns:wp="http://schemas.openxmlformats.org/drawingml/2006/wordprocessingDrawing" xmlns:w10="urn:schemas-microsoft-com:office:word" xmlns:w="http://schemas.openxmlformats.org/wordprocessingml/2006/main" xmlns:w14="http://schemas.microsoft.com/office/word/2010/wordml" xmlns:w15="http://schemas.microsoft.com/office/word/2012/wordml" xmlns:w16se="http://schemas.microsoft.com/office/word/2015/wordml/symex" xmlns:wpg="http://schemas.microsoft.com/office/word/2010/wordprocessingGroup" xmlns:wpi="http://schemas.microsoft.com/office/word/2010/wordprocessingInk" xmlns:wne="http://schemas.microsoft.com/office/word/2006/wordml" xmlns:wps="http://schemas.microsoft.com/office/word/2010/wordprocessingShape" mc:Ignorable="w14 w15 w16se wp14">
+  <w:endnote w:type="separator" w:id="-1">
     <w:p>
       <w:r>
         <w:separator/>
       </w:r>
     </w:p>
   </w:endnote>
-  <w:endnote w:type="continuationSeparator" w:id="1">
+  <w:endnote w:type="continuationSeparator" w:id="0">
     <w:p>
       <w:r>
         <w:continuationSeparator/>
@@ -8129,7 +8414,17 @@
 </file>
 
 <file path=word/footer1.xml><?xml version="1.0" encoding="utf-8"?>
-<w:ftr xmlns:ve="http://schemas.openxmlformats.org/markup-compatibility/2006" xmlns:o="urn:schemas-microsoft-com:office:office" xmlns:r="http://schemas.openxmlformats.org/officeDocument/2006/relationships" xmlns:m="http://schemas.openxmlformats.org/officeDocument/2006/math" xmlns:v="urn:schemas-microsoft-com:vml" xmlns:wp="http://schemas.openxmlformats.org/drawingml/2006/wordprocessingDrawing" xmlns:w10="urn:schemas-microsoft-com:office:word" xmlns:w="http://schemas.openxmlformats.org/wordprocessingml/2006/main" xmlns:wne="http://schemas.microsoft.com/office/word/2006/wordml">
+<w:ftr xmlns:wpc="http://schemas.microsoft.com/office/word/2010/wordprocessingCanvas" xmlns:cx="http://schemas.microsoft.com/office/drawing/2014/chartex" xmlns:cx1="http://schemas.microsoft.com/office/drawing/2015/9/8/chartex" xmlns:mc="http://schemas.openxmlformats.org/markup-compatibility/2006" xmlns:o="urn:schemas-microsoft-com:office:office" xmlns:r="http://schemas.openxmlformats.org/officeDocument/2006/relationships" xmlns:m="http://schemas.openxmlformats.org/officeDocument/2006/math" xmlns:v="urn:schemas-microsoft-com:vml" xmlns:wp14="http://schemas.microsoft.com/office/word/2010/wordprocessingDrawing" xmlns:wp="http://schemas.openxmlformats.org/drawingml/2006/wordprocessingDrawing" xmlns:w10="urn:schemas-microsoft-com:office:word" xmlns:w="http://schemas.openxmlformats.org/wordprocessingml/2006/main" xmlns:w14="http://schemas.microsoft.com/office/word/2010/wordml" xmlns:w15="http://schemas.microsoft.com/office/word/2012/wordml" xmlns:w16se="http://schemas.microsoft.com/office/word/2015/wordml/symex" xmlns:wpg="http://schemas.microsoft.com/office/word/2010/wordprocessingGroup" xmlns:wpi="http://schemas.microsoft.com/office/word/2010/wordprocessingInk" xmlns:wne="http://schemas.microsoft.com/office/word/2006/wordml" xmlns:wps="http://schemas.microsoft.com/office/word/2010/wordprocessingShape" mc:Ignorable="w14 w15 w16se wp14">
+  <w:p>
+    <w:pPr>
+      <w:pStyle w:val="ae"/>
+    </w:pPr>
+  </w:p>
+</w:ftr>
+</file>
+
+<file path=word/footer2.xml><?xml version="1.0" encoding="utf-8"?>
+<w:ftr xmlns:wpc="http://schemas.microsoft.com/office/word/2010/wordprocessingCanvas" xmlns:cx="http://schemas.microsoft.com/office/drawing/2014/chartex" xmlns:cx1="http://schemas.microsoft.com/office/drawing/2015/9/8/chartex" xmlns:mc="http://schemas.openxmlformats.org/markup-compatibility/2006" xmlns:o="urn:schemas-microsoft-com:office:office" xmlns:r="http://schemas.openxmlformats.org/officeDocument/2006/relationships" xmlns:m="http://schemas.openxmlformats.org/officeDocument/2006/math" xmlns:v="urn:schemas-microsoft-com:vml" xmlns:wp14="http://schemas.microsoft.com/office/word/2010/wordprocessingDrawing" xmlns:wp="http://schemas.openxmlformats.org/drawingml/2006/wordprocessingDrawing" xmlns:w10="urn:schemas-microsoft-com:office:word" xmlns:w="http://schemas.openxmlformats.org/wordprocessingml/2006/main" xmlns:w14="http://schemas.microsoft.com/office/word/2010/wordml" xmlns:w15="http://schemas.microsoft.com/office/word/2012/wordml" xmlns:w16se="http://schemas.microsoft.com/office/word/2015/wordml/symex" xmlns:wpg="http://schemas.microsoft.com/office/word/2010/wordprocessingGroup" xmlns:wpi="http://schemas.microsoft.com/office/word/2010/wordprocessingInk" xmlns:wne="http://schemas.microsoft.com/office/word/2006/wordml" xmlns:wps="http://schemas.microsoft.com/office/word/2010/wordprocessingShape" mc:Ignorable="w14 w15 w16se wp14">
   <w:p>
     <w:pPr>
       <w:tabs>
@@ -8165,8 +8460,18 @@
 </w:ftr>
 </file>
 
-<file path=word/footer2.xml><?xml version="1.0" encoding="utf-8"?>
-<w:ftr xmlns:ve="http://schemas.openxmlformats.org/markup-compatibility/2006" xmlns:o="urn:schemas-microsoft-com:office:office" xmlns:r="http://schemas.openxmlformats.org/officeDocument/2006/relationships" xmlns:m="http://schemas.openxmlformats.org/officeDocument/2006/math" xmlns:v="urn:schemas-microsoft-com:vml" xmlns:wp="http://schemas.openxmlformats.org/drawingml/2006/wordprocessingDrawing" xmlns:w10="urn:schemas-microsoft-com:office:word" xmlns:w="http://schemas.openxmlformats.org/wordprocessingml/2006/main" xmlns:wne="http://schemas.microsoft.com/office/word/2006/wordml">
+<file path=word/footer3.xml><?xml version="1.0" encoding="utf-8"?>
+<w:ftr xmlns:wpc="http://schemas.microsoft.com/office/word/2010/wordprocessingCanvas" xmlns:cx="http://schemas.microsoft.com/office/drawing/2014/chartex" xmlns:cx1="http://schemas.microsoft.com/office/drawing/2015/9/8/chartex" xmlns:mc="http://schemas.openxmlformats.org/markup-compatibility/2006" xmlns:o="urn:schemas-microsoft-com:office:office" xmlns:r="http://schemas.openxmlformats.org/officeDocument/2006/relationships" xmlns:m="http://schemas.openxmlformats.org/officeDocument/2006/math" xmlns:v="urn:schemas-microsoft-com:vml" xmlns:wp14="http://schemas.microsoft.com/office/word/2010/wordprocessingDrawing" xmlns:wp="http://schemas.openxmlformats.org/drawingml/2006/wordprocessingDrawing" xmlns:w10="urn:schemas-microsoft-com:office:word" xmlns:w="http://schemas.openxmlformats.org/wordprocessingml/2006/main" xmlns:w14="http://schemas.microsoft.com/office/word/2010/wordml" xmlns:w15="http://schemas.microsoft.com/office/word/2012/wordml" xmlns:w16se="http://schemas.microsoft.com/office/word/2015/wordml/symex" xmlns:wpg="http://schemas.microsoft.com/office/word/2010/wordprocessingGroup" xmlns:wpi="http://schemas.microsoft.com/office/word/2010/wordprocessingInk" xmlns:wne="http://schemas.microsoft.com/office/word/2006/wordml" xmlns:wps="http://schemas.microsoft.com/office/word/2010/wordprocessingShape" mc:Ignorable="w14 w15 w16se wp14">
+  <w:p>
+    <w:pPr>
+      <w:pStyle w:val="ae"/>
+    </w:pPr>
+  </w:p>
+</w:ftr>
+</file>
+
+<file path=word/footer4.xml><?xml version="1.0" encoding="utf-8"?>
+<w:ftr xmlns:wpc="http://schemas.microsoft.com/office/word/2010/wordprocessingCanvas" xmlns:cx="http://schemas.microsoft.com/office/drawing/2014/chartex" xmlns:cx1="http://schemas.microsoft.com/office/drawing/2015/9/8/chartex" xmlns:mc="http://schemas.openxmlformats.org/markup-compatibility/2006" xmlns:o="urn:schemas-microsoft-com:office:office" xmlns:r="http://schemas.openxmlformats.org/officeDocument/2006/relationships" xmlns:m="http://schemas.openxmlformats.org/officeDocument/2006/math" xmlns:v="urn:schemas-microsoft-com:vml" xmlns:wp14="http://schemas.microsoft.com/office/word/2010/wordprocessingDrawing" xmlns:wp="http://schemas.openxmlformats.org/drawingml/2006/wordprocessingDrawing" xmlns:w10="urn:schemas-microsoft-com:office:word" xmlns:w="http://schemas.openxmlformats.org/wordprocessingml/2006/main" xmlns:w14="http://schemas.microsoft.com/office/word/2010/wordml" xmlns:w15="http://schemas.microsoft.com/office/word/2012/wordml" xmlns:w16se="http://schemas.microsoft.com/office/word/2015/wordml/symex" xmlns:wpg="http://schemas.microsoft.com/office/word/2010/wordprocessingGroup" xmlns:wpi="http://schemas.microsoft.com/office/word/2010/wordprocessingInk" xmlns:wne="http://schemas.microsoft.com/office/word/2006/wordml" xmlns:wps="http://schemas.microsoft.com/office/word/2010/wordprocessingShape" mc:Ignorable="w14 w15 w16se wp14">
   <w:p>
     <w:pPr>
       <w:pStyle w:val="ae"/>
@@ -8176,15 +8481,15 @@
 </file>
 
 <file path=word/footnotes.xml><?xml version="1.0" encoding="utf-8"?>
-<w:footnotes xmlns:ve="http://schemas.openxmlformats.org/markup-compatibility/2006" xmlns:o="urn:schemas-microsoft-com:office:office" xmlns:r="http://schemas.openxmlformats.org/officeDocument/2006/relationships" xmlns:m="http://schemas.openxmlformats.org/officeDocument/2006/math" xmlns:v="urn:schemas-microsoft-com:vml" xmlns:wp="http://schemas.openxmlformats.org/drawingml/2006/wordprocessingDrawing" xmlns:w10="urn:schemas-microsoft-com:office:word" xmlns:w="http://schemas.openxmlformats.org/wordprocessingml/2006/main" xmlns:wne="http://schemas.microsoft.com/office/word/2006/wordml">
-  <w:footnote w:type="separator" w:id="0">
+<w:footnotes xmlns:wpc="http://schemas.microsoft.com/office/word/2010/wordprocessingCanvas" xmlns:cx="http://schemas.microsoft.com/office/drawing/2014/chartex" xmlns:cx1="http://schemas.microsoft.com/office/drawing/2015/9/8/chartex" xmlns:mc="http://schemas.openxmlformats.org/markup-compatibility/2006" xmlns:o="urn:schemas-microsoft-com:office:office" xmlns:r="http://schemas.openxmlformats.org/officeDocument/2006/relationships" xmlns:m="http://schemas.openxmlformats.org/officeDocument/2006/math" xmlns:v="urn:schemas-microsoft-com:vml" xmlns:wp14="http://schemas.microsoft.com/office/word/2010/wordprocessingDrawing" xmlns:wp="http://schemas.openxmlformats.org/drawingml/2006/wordprocessingDrawing" xmlns:w10="urn:schemas-microsoft-com:office:word" xmlns:w="http://schemas.openxmlformats.org/wordprocessingml/2006/main" xmlns:w14="http://schemas.microsoft.com/office/word/2010/wordml" xmlns:w15="http://schemas.microsoft.com/office/word/2012/wordml" xmlns:w16se="http://schemas.microsoft.com/office/word/2015/wordml/symex" xmlns:wpg="http://schemas.microsoft.com/office/word/2010/wordprocessingGroup" xmlns:wpi="http://schemas.microsoft.com/office/word/2010/wordprocessingInk" xmlns:wne="http://schemas.microsoft.com/office/word/2006/wordml" xmlns:wps="http://schemas.microsoft.com/office/word/2010/wordprocessingShape" mc:Ignorable="w14 w15 w16se wp14">
+  <w:footnote w:type="separator" w:id="-1">
     <w:p>
       <w:r>
         <w:separator/>
       </w:r>
     </w:p>
   </w:footnote>
-  <w:footnote w:type="continuationSeparator" w:id="1">
+  <w:footnote w:type="continuationSeparator" w:id="0">
     <w:p>
       <w:r>
         <w:continuationSeparator/>
@@ -8194,9 +8499,83 @@
 </w:footnotes>
 </file>
 
+<file path=word/header1.xml><?xml version="1.0" encoding="utf-8"?>
+<w:hdr xmlns:wpc="http://schemas.microsoft.com/office/word/2010/wordprocessingCanvas" xmlns:cx="http://schemas.microsoft.com/office/drawing/2014/chartex" xmlns:cx1="http://schemas.microsoft.com/office/drawing/2015/9/8/chartex" xmlns:mc="http://schemas.openxmlformats.org/markup-compatibility/2006" xmlns:o="urn:schemas-microsoft-com:office:office" xmlns:r="http://schemas.openxmlformats.org/officeDocument/2006/relationships" xmlns:m="http://schemas.openxmlformats.org/officeDocument/2006/math" xmlns:v="urn:schemas-microsoft-com:vml" xmlns:wp14="http://schemas.microsoft.com/office/word/2010/wordprocessingDrawing" xmlns:wp="http://schemas.openxmlformats.org/drawingml/2006/wordprocessingDrawing" xmlns:w10="urn:schemas-microsoft-com:office:word" xmlns:w="http://schemas.openxmlformats.org/wordprocessingml/2006/main" xmlns:w14="http://schemas.microsoft.com/office/word/2010/wordml" xmlns:w15="http://schemas.microsoft.com/office/word/2012/wordml" xmlns:w16se="http://schemas.microsoft.com/office/word/2015/wordml/symex" xmlns:wpg="http://schemas.microsoft.com/office/word/2010/wordprocessingGroup" xmlns:wpi="http://schemas.microsoft.com/office/word/2010/wordprocessingInk" xmlns:wne="http://schemas.microsoft.com/office/word/2006/wordml" xmlns:wps="http://schemas.microsoft.com/office/word/2010/wordprocessingShape" mc:Ignorable="w14 w15 w16se wp14">
+  <w:p>
+    <w:pPr>
+      <w:pStyle w:val="ac"/>
+    </w:pPr>
+  </w:p>
+</w:hdr>
+</file>
+
+<file path=word/header2.xml><?xml version="1.0" encoding="utf-8"?>
+<w:hdr xmlns:wpc="http://schemas.microsoft.com/office/word/2010/wordprocessingCanvas" xmlns:cx="http://schemas.microsoft.com/office/drawing/2014/chartex" xmlns:cx1="http://schemas.microsoft.com/office/drawing/2015/9/8/chartex" xmlns:mc="http://schemas.openxmlformats.org/markup-compatibility/2006" xmlns:o="urn:schemas-microsoft-com:office:office" xmlns:r="http://schemas.openxmlformats.org/officeDocument/2006/relationships" xmlns:m="http://schemas.openxmlformats.org/officeDocument/2006/math" xmlns:v="urn:schemas-microsoft-com:vml" xmlns:wp14="http://schemas.microsoft.com/office/word/2010/wordprocessingDrawing" xmlns:wp="http://schemas.openxmlformats.org/drawingml/2006/wordprocessingDrawing" xmlns:w10="urn:schemas-microsoft-com:office:word" xmlns:w="http://schemas.openxmlformats.org/wordprocessingml/2006/main" xmlns:w14="http://schemas.microsoft.com/office/word/2010/wordml" xmlns:w15="http://schemas.microsoft.com/office/word/2012/wordml" xmlns:w16se="http://schemas.microsoft.com/office/word/2015/wordml/symex" xmlns:wpg="http://schemas.microsoft.com/office/word/2010/wordprocessingGroup" xmlns:wpi="http://schemas.microsoft.com/office/word/2010/wordprocessingInk" xmlns:wne="http://schemas.microsoft.com/office/word/2006/wordml" xmlns:wps="http://schemas.microsoft.com/office/word/2010/wordprocessingShape" mc:Ignorable="w14 w15 w16se wp14">
+  <w:sdt>
+    <w:sdtPr>
+      <w:id w:val="1928836398"/>
+      <w:docPartObj>
+        <w:docPartGallery w:val="Watermarks"/>
+        <w:docPartUnique/>
+      </w:docPartObj>
+    </w:sdtPr>
+    <w:sdtContent>
+      <w:p>
+        <w:pPr>
+          <w:pStyle w:val="ac"/>
+        </w:pPr>
+        <w:r>
+          <w:pict>
+            <v:shapetype id="_x0000_t136" coordsize="21600,21600" o:spt="136" adj="10800" path="m@7,l@8,m@5,21600l@6,21600e">
+              <v:formulas>
+                <v:f eqn="sum #0 0 10800"/>
+                <v:f eqn="prod #0 2 1"/>
+                <v:f eqn="sum 21600 0 @1"/>
+                <v:f eqn="sum 0 0 @2"/>
+                <v:f eqn="sum 21600 0 @3"/>
+                <v:f eqn="if @0 @3 0"/>
+                <v:f eqn="if @0 21600 @1"/>
+                <v:f eqn="if @0 0 @2"/>
+                <v:f eqn="if @0 @4 21600"/>
+                <v:f eqn="mid @5 @6"/>
+                <v:f eqn="mid @8 @5"/>
+                <v:f eqn="mid @7 @8"/>
+                <v:f eqn="mid @6 @7"/>
+                <v:f eqn="sum @6 0 @5"/>
+              </v:formulas>
+              <v:path textpathok="t" o:connecttype="custom" o:connectlocs="@9,0;@10,10800;@11,21600;@12,10800" o:connectangles="270,180,90,0"/>
+              <v:textpath on="t" fitshape="t"/>
+              <v:handles>
+                <v:h position="#0,bottomRight" xrange="6629,14971"/>
+              </v:handles>
+              <o:lock v:ext="edit" text="t" shapetype="t"/>
+            </v:shapetype>
+            <v:shape id="PowerPlusWaterMarkObject357922611" o:spid="_x0000_s2049" type="#_x0000_t136" style="position:absolute;margin-left:0;margin-top:0;width:461.85pt;height:197.95pt;rotation:315;z-index:-251657216;mso-position-horizontal:center;mso-position-horizontal-relative:margin;mso-position-vertical:center;mso-position-vertical-relative:margin" o:allowincell="f" fillcolor="silver" stroked="f">
+              <v:fill opacity=".5"/>
+              <v:textpath style="font-family:&quot;calibri&quot;;font-size:1pt" string="ОБРАЗЕЦ"/>
+              <w10:wrap anchorx="margin" anchory="margin"/>
+            </v:shape>
+          </w:pict>
+        </w:r>
+      </w:p>
+    </w:sdtContent>
+  </w:sdt>
+</w:hdr>
+</file>
+
+<file path=word/header3.xml><?xml version="1.0" encoding="utf-8"?>
+<w:hdr xmlns:wpc="http://schemas.microsoft.com/office/word/2010/wordprocessingCanvas" xmlns:cx="http://schemas.microsoft.com/office/drawing/2014/chartex" xmlns:cx1="http://schemas.microsoft.com/office/drawing/2015/9/8/chartex" xmlns:mc="http://schemas.openxmlformats.org/markup-compatibility/2006" xmlns:o="urn:schemas-microsoft-com:office:office" xmlns:r="http://schemas.openxmlformats.org/officeDocument/2006/relationships" xmlns:m="http://schemas.openxmlformats.org/officeDocument/2006/math" xmlns:v="urn:schemas-microsoft-com:vml" xmlns:wp14="http://schemas.microsoft.com/office/word/2010/wordprocessingDrawing" xmlns:wp="http://schemas.openxmlformats.org/drawingml/2006/wordprocessingDrawing" xmlns:w10="urn:schemas-microsoft-com:office:word" xmlns:w="http://schemas.openxmlformats.org/wordprocessingml/2006/main" xmlns:w14="http://schemas.microsoft.com/office/word/2010/wordml" xmlns:w15="http://schemas.microsoft.com/office/word/2012/wordml" xmlns:w16se="http://schemas.microsoft.com/office/word/2015/wordml/symex" xmlns:wpg="http://schemas.microsoft.com/office/word/2010/wordprocessingGroup" xmlns:wpi="http://schemas.microsoft.com/office/word/2010/wordprocessingInk" xmlns:wne="http://schemas.microsoft.com/office/word/2006/wordml" xmlns:wps="http://schemas.microsoft.com/office/word/2010/wordprocessingShape" mc:Ignorable="w14 w15 w16se wp14">
+  <w:p>
+    <w:pPr>
+      <w:pStyle w:val="ac"/>
+    </w:pPr>
+  </w:p>
+</w:hdr>
+</file>
+
 <file path=word/numbering.xml><?xml version="1.0" encoding="utf-8"?>
-<w:numbering xmlns:ve="http://schemas.openxmlformats.org/markup-compatibility/2006" xmlns:o="urn:schemas-microsoft-com:office:office" xmlns:r="http://schemas.openxmlformats.org/officeDocument/2006/relationships" xmlns:m="http://schemas.openxmlformats.org/officeDocument/2006/math" xmlns:v="urn:schemas-microsoft-com:vml" xmlns:wp="http://schemas.openxmlformats.org/drawingml/2006/wordprocessingDrawing" xmlns:w10="urn:schemas-microsoft-com:office:word" xmlns:w="http://schemas.openxmlformats.org/wordprocessingml/2006/main" xmlns:wne="http://schemas.microsoft.com/office/word/2006/wordml">
-  <w:abstractNum w:abstractNumId="0">
+<w:numbering xmlns:wpc="http://schemas.microsoft.com/office/word/2010/wordprocessingCanvas" xmlns:cx="http://schemas.microsoft.com/office/drawing/2014/chartex" xmlns:cx1="http://schemas.microsoft.com/office/drawing/2015/9/8/chartex" xmlns:mc="http://schemas.openxmlformats.org/markup-compatibility/2006" xmlns:o="urn:schemas-microsoft-com:office:office" xmlns:r="http://schemas.openxmlformats.org/officeDocument/2006/relationships" xmlns:m="http://schemas.openxmlformats.org/officeDocument/2006/math" xmlns:v="urn:schemas-microsoft-com:vml" xmlns:wp14="http://schemas.microsoft.com/office/word/2010/wordprocessingDrawing" xmlns:wp="http://schemas.openxmlformats.org/drawingml/2006/wordprocessingDrawing" xmlns:w10="urn:schemas-microsoft-com:office:word" xmlns:w="http://schemas.openxmlformats.org/wordprocessingml/2006/main" xmlns:w14="http://schemas.microsoft.com/office/word/2010/wordml" xmlns:w15="http://schemas.microsoft.com/office/word/2012/wordml" xmlns:w16se="http://schemas.microsoft.com/office/word/2015/wordml/symex" xmlns:wpg="http://schemas.microsoft.com/office/word/2010/wordprocessingGroup" xmlns:wpi="http://schemas.microsoft.com/office/word/2010/wordprocessingInk" xmlns:wne="http://schemas.microsoft.com/office/word/2006/wordml" xmlns:wps="http://schemas.microsoft.com/office/word/2010/wordprocessingShape" mc:Ignorable="w14 w15 w16se wp14">
+  <w:abstractNum w:abstractNumId="0" w15:restartNumberingAfterBreak="0">
     <w:nsid w:val="620F168F"/>
     <w:multiLevelType w:val="multilevel"/>
     <w:tmpl w:val="F1F49DA8"/>
@@ -8353,7 +8732,7 @@
 </file>
 
 <file path=word/styles.xml><?xml version="1.0" encoding="utf-8"?>
-<w:styles xmlns:r="http://schemas.openxmlformats.org/officeDocument/2006/relationships" xmlns:w="http://schemas.openxmlformats.org/wordprocessingml/2006/main">
+<w:styles xmlns:mc="http://schemas.openxmlformats.org/markup-compatibility/2006" xmlns:r="http://schemas.openxmlformats.org/officeDocument/2006/relationships" xmlns:w="http://schemas.openxmlformats.org/wordprocessingml/2006/main" xmlns:w14="http://schemas.microsoft.com/office/word/2010/wordml" xmlns:w15="http://schemas.microsoft.com/office/word/2012/wordml" xmlns:w16se="http://schemas.microsoft.com/office/word/2015/wordml/symex" mc:Ignorable="w14 w15 w16se">
   <w:docDefaults>
     <w:rPrDefault>
       <w:rPr>
@@ -8363,7 +8742,7 @@
     </w:rPrDefault>
     <w:pPrDefault/>
   </w:docDefaults>
-  <w:latentStyles w:defLockedState="0" w:defUIPriority="0" w:defSemiHidden="0" w:defUnhideWhenUsed="0" w:defQFormat="0" w:count="267">
+  <w:latentStyles w:defLockedState="0" w:defUIPriority="0" w:defSemiHidden="0" w:defUnhideWhenUsed="0" w:defQFormat="0" w:count="371">
     <w:lsdException w:name="Normal" w:qFormat="1"/>
     <w:lsdException w:name="heading 1" w:qFormat="1"/>
     <w:lsdException w:name="heading 2" w:semiHidden="1" w:unhideWhenUsed="1" w:qFormat="1"/>
@@ -8374,12 +8753,101 @@
     <w:lsdException w:name="heading 7" w:semiHidden="1" w:unhideWhenUsed="1" w:qFormat="1"/>
     <w:lsdException w:name="heading 8" w:semiHidden="1" w:unhideWhenUsed="1" w:qFormat="1"/>
     <w:lsdException w:name="heading 9" w:semiHidden="1" w:unhideWhenUsed="1" w:qFormat="1"/>
+    <w:lsdException w:name="index 1" w:semiHidden="1" w:unhideWhenUsed="1"/>
+    <w:lsdException w:name="index 2" w:semiHidden="1" w:unhideWhenUsed="1"/>
+    <w:lsdException w:name="index 3" w:semiHidden="1" w:unhideWhenUsed="1"/>
+    <w:lsdException w:name="index 4" w:semiHidden="1" w:unhideWhenUsed="1"/>
+    <w:lsdException w:name="index 5" w:semiHidden="1" w:unhideWhenUsed="1"/>
+    <w:lsdException w:name="index 6" w:semiHidden="1" w:unhideWhenUsed="1"/>
+    <w:lsdException w:name="index 7" w:semiHidden="1" w:unhideWhenUsed="1"/>
+    <w:lsdException w:name="index 8" w:semiHidden="1" w:unhideWhenUsed="1"/>
+    <w:lsdException w:name="index 9" w:semiHidden="1" w:unhideWhenUsed="1"/>
+    <w:lsdException w:name="toc 1" w:semiHidden="1" w:unhideWhenUsed="1"/>
+    <w:lsdException w:name="toc 2" w:semiHidden="1" w:unhideWhenUsed="1"/>
+    <w:lsdException w:name="toc 3" w:semiHidden="1" w:unhideWhenUsed="1"/>
+    <w:lsdException w:name="toc 4" w:semiHidden="1" w:unhideWhenUsed="1"/>
+    <w:lsdException w:name="toc 5" w:semiHidden="1" w:unhideWhenUsed="1"/>
+    <w:lsdException w:name="toc 6" w:semiHidden="1" w:unhideWhenUsed="1"/>
+    <w:lsdException w:name="toc 7" w:semiHidden="1" w:unhideWhenUsed="1"/>
+    <w:lsdException w:name="toc 8" w:semiHidden="1" w:unhideWhenUsed="1"/>
+    <w:lsdException w:name="toc 9" w:semiHidden="1" w:unhideWhenUsed="1"/>
+    <w:lsdException w:name="Normal Indent" w:semiHidden="1" w:unhideWhenUsed="1"/>
+    <w:lsdException w:name="footnote text" w:semiHidden="1" w:unhideWhenUsed="1"/>
+    <w:lsdException w:name="annotation text" w:semiHidden="1" w:unhideWhenUsed="1"/>
+    <w:lsdException w:name="header" w:semiHidden="1" w:unhideWhenUsed="1"/>
+    <w:lsdException w:name="footer" w:semiHidden="1" w:unhideWhenUsed="1"/>
+    <w:lsdException w:name="index heading" w:semiHidden="1" w:unhideWhenUsed="1"/>
     <w:lsdException w:name="caption" w:semiHidden="1" w:unhideWhenUsed="1" w:qFormat="1"/>
+    <w:lsdException w:name="table of figures" w:semiHidden="1" w:unhideWhenUsed="1"/>
+    <w:lsdException w:name="envelope address" w:semiHidden="1" w:unhideWhenUsed="1"/>
+    <w:lsdException w:name="envelope return" w:semiHidden="1" w:unhideWhenUsed="1"/>
+    <w:lsdException w:name="footnote reference" w:semiHidden="1" w:unhideWhenUsed="1"/>
+    <w:lsdException w:name="annotation reference" w:semiHidden="1" w:unhideWhenUsed="1"/>
+    <w:lsdException w:name="line number" w:semiHidden="1" w:unhideWhenUsed="1"/>
+    <w:lsdException w:name="page number" w:semiHidden="1" w:unhideWhenUsed="1"/>
+    <w:lsdException w:name="endnote reference" w:semiHidden="1" w:unhideWhenUsed="1"/>
+    <w:lsdException w:name="endnote text" w:semiHidden="1" w:unhideWhenUsed="1"/>
+    <w:lsdException w:name="table of authorities" w:semiHidden="1" w:unhideWhenUsed="1"/>
+    <w:lsdException w:name="macro" w:semiHidden="1" w:unhideWhenUsed="1"/>
+    <w:lsdException w:name="toa heading" w:semiHidden="1" w:unhideWhenUsed="1"/>
+    <w:lsdException w:name="List" w:semiHidden="1" w:unhideWhenUsed="1"/>
+    <w:lsdException w:name="List Bullet" w:semiHidden="1" w:unhideWhenUsed="1"/>
+    <w:lsdException w:name="List 2" w:semiHidden="1" w:unhideWhenUsed="1"/>
+    <w:lsdException w:name="List 3" w:semiHidden="1" w:unhideWhenUsed="1"/>
+    <w:lsdException w:name="List Bullet 2" w:semiHidden="1" w:unhideWhenUsed="1"/>
+    <w:lsdException w:name="List Bullet 3" w:semiHidden="1" w:unhideWhenUsed="1"/>
+    <w:lsdException w:name="List Bullet 4" w:semiHidden="1" w:unhideWhenUsed="1"/>
+    <w:lsdException w:name="List Bullet 5" w:semiHidden="1" w:unhideWhenUsed="1"/>
+    <w:lsdException w:name="List Number 2" w:semiHidden="1" w:unhideWhenUsed="1"/>
+    <w:lsdException w:name="List Number 3" w:semiHidden="1" w:unhideWhenUsed="1"/>
+    <w:lsdException w:name="List Number 4" w:semiHidden="1" w:unhideWhenUsed="1"/>
+    <w:lsdException w:name="List Number 5" w:semiHidden="1" w:unhideWhenUsed="1"/>
     <w:lsdException w:name="Title" w:qFormat="1"/>
+    <w:lsdException w:name="Closing" w:semiHidden="1" w:unhideWhenUsed="1"/>
+    <w:lsdException w:name="Signature" w:semiHidden="1" w:unhideWhenUsed="1"/>
+    <w:lsdException w:name="Default Paragraph Font" w:semiHidden="1" w:unhideWhenUsed="1"/>
+    <w:lsdException w:name="Body Text" w:semiHidden="1" w:unhideWhenUsed="1"/>
+    <w:lsdException w:name="Body Text Indent" w:semiHidden="1" w:unhideWhenUsed="1"/>
+    <w:lsdException w:name="List Continue" w:semiHidden="1" w:unhideWhenUsed="1"/>
+    <w:lsdException w:name="List Continue 2" w:semiHidden="1" w:unhideWhenUsed="1"/>
+    <w:lsdException w:name="List Continue 3" w:semiHidden="1" w:unhideWhenUsed="1"/>
+    <w:lsdException w:name="List Continue 4" w:semiHidden="1" w:unhideWhenUsed="1"/>
+    <w:lsdException w:name="List Continue 5" w:semiHidden="1" w:unhideWhenUsed="1"/>
+    <w:lsdException w:name="Message Header" w:semiHidden="1" w:unhideWhenUsed="1"/>
     <w:lsdException w:name="Subtitle" w:qFormat="1"/>
+    <w:lsdException w:name="Body Text First Indent 2" w:semiHidden="1" w:unhideWhenUsed="1"/>
+    <w:lsdException w:name="Note Heading" w:semiHidden="1" w:unhideWhenUsed="1"/>
+    <w:lsdException w:name="Body Text 2" w:semiHidden="1" w:unhideWhenUsed="1"/>
+    <w:lsdException w:name="Body Text 3" w:semiHidden="1" w:unhideWhenUsed="1"/>
+    <w:lsdException w:name="Body Text Indent 2" w:semiHidden="1" w:unhideWhenUsed="1"/>
+    <w:lsdException w:name="Body Text Indent 3" w:semiHidden="1" w:unhideWhenUsed="1"/>
+    <w:lsdException w:name="Block Text" w:semiHidden="1" w:unhideWhenUsed="1"/>
+    <w:lsdException w:name="Hyperlink" w:semiHidden="1" w:unhideWhenUsed="1"/>
+    <w:lsdException w:name="FollowedHyperlink" w:semiHidden="1" w:unhideWhenUsed="1"/>
     <w:lsdException w:name="Strong" w:qFormat="1"/>
     <w:lsdException w:name="Emphasis" w:qFormat="1"/>
+    <w:lsdException w:name="Document Map" w:semiHidden="1" w:unhideWhenUsed="1"/>
+    <w:lsdException w:name="Plain Text" w:semiHidden="1" w:unhideWhenUsed="1"/>
+    <w:lsdException w:name="E-mail Signature" w:semiHidden="1" w:unhideWhenUsed="1"/>
+    <w:lsdException w:name="HTML Top of Form" w:semiHidden="1" w:unhideWhenUsed="1"/>
+    <w:lsdException w:name="HTML Bottom of Form" w:semiHidden="1" w:unhideWhenUsed="1"/>
+    <w:lsdException w:name="Normal (Web)" w:semiHidden="1" w:unhideWhenUsed="1"/>
+    <w:lsdException w:name="HTML Acronym" w:semiHidden="1" w:unhideWhenUsed="1"/>
+    <w:lsdException w:name="HTML Address" w:semiHidden="1" w:unhideWhenUsed="1"/>
+    <w:lsdException w:name="HTML Cite" w:semiHidden="1" w:unhideWhenUsed="1"/>
+    <w:lsdException w:name="HTML Code" w:semiHidden="1" w:unhideWhenUsed="1"/>
+    <w:lsdException w:name="HTML Definition" w:semiHidden="1" w:unhideWhenUsed="1"/>
+    <w:lsdException w:name="HTML Keyboard" w:semiHidden="1" w:unhideWhenUsed="1"/>
+    <w:lsdException w:name="HTML Preformatted" w:semiHidden="1" w:unhideWhenUsed="1"/>
+    <w:lsdException w:name="HTML Sample" w:semiHidden="1" w:unhideWhenUsed="1"/>
+    <w:lsdException w:name="HTML Typewriter" w:semiHidden="1" w:unhideWhenUsed="1"/>
+    <w:lsdException w:name="HTML Variable" w:semiHidden="1" w:unhideWhenUsed="1"/>
     <w:lsdException w:name="Normal Table" w:semiHidden="1" w:unhideWhenUsed="1"/>
+    <w:lsdException w:name="annotation subject" w:semiHidden="1" w:unhideWhenUsed="1"/>
+    <w:lsdException w:name="No List" w:semiHidden="1" w:unhideWhenUsed="1"/>
+    <w:lsdException w:name="Outline List 1" w:semiHidden="1" w:unhideWhenUsed="1"/>
+    <w:lsdException w:name="Outline List 2" w:semiHidden="1" w:unhideWhenUsed="1"/>
+    <w:lsdException w:name="Outline List 3" w:semiHidden="1" w:unhideWhenUsed="1"/>
     <w:lsdException w:name="Table Simple 1" w:semiHidden="1" w:unhideWhenUsed="1"/>
     <w:lsdException w:name="Table Simple 2" w:semiHidden="1" w:unhideWhenUsed="1"/>
     <w:lsdException w:name="Table Simple 3" w:semiHidden="1" w:unhideWhenUsed="1"/>
@@ -8422,6 +8890,7 @@
     <w:lsdException w:name="Table Web 1" w:semiHidden="1" w:unhideWhenUsed="1"/>
     <w:lsdException w:name="Table Web 2" w:semiHidden="1" w:unhideWhenUsed="1"/>
     <w:lsdException w:name="Table Web 3" w:semiHidden="1" w:unhideWhenUsed="1"/>
+    <w:lsdException w:name="Balloon Text" w:semiHidden="1" w:unhideWhenUsed="1"/>
     <w:lsdException w:name="Table Theme" w:semiHidden="1" w:unhideWhenUsed="1"/>
     <w:lsdException w:name="Placeholder Text" w:semiHidden="1" w:uiPriority="99"/>
     <w:lsdException w:name="No Spacing" w:uiPriority="1" w:qFormat="1"/>
@@ -8534,6 +9003,110 @@
     <w:lsdException w:name="Book Title" w:uiPriority="33" w:qFormat="1"/>
     <w:lsdException w:name="Bibliography" w:semiHidden="1" w:uiPriority="37" w:unhideWhenUsed="1"/>
     <w:lsdException w:name="TOC Heading" w:semiHidden="1" w:uiPriority="39" w:unhideWhenUsed="1" w:qFormat="1"/>
+    <w:lsdException w:name="Plain Table 1" w:uiPriority="41"/>
+    <w:lsdException w:name="Plain Table 2" w:uiPriority="42"/>
+    <w:lsdException w:name="Plain Table 3" w:uiPriority="43"/>
+    <w:lsdException w:name="Plain Table 4" w:uiPriority="44"/>
+    <w:lsdException w:name="Plain Table 5" w:uiPriority="45"/>
+    <w:lsdException w:name="Grid Table Light" w:uiPriority="40"/>
+    <w:lsdException w:name="Grid Table 1 Light" w:uiPriority="46"/>
+    <w:lsdException w:name="Grid Table 2" w:uiPriority="47"/>
+    <w:lsdException w:name="Grid Table 3" w:uiPriority="48"/>
+    <w:lsdException w:name="Grid Table 4" w:uiPriority="49"/>
+    <w:lsdException w:name="Grid Table 5 Dark" w:uiPriority="50"/>
+    <w:lsdException w:name="Grid Table 6 Colorful" w:uiPriority="51"/>
+    <w:lsdException w:name="Grid Table 7 Colorful" w:uiPriority="52"/>
+    <w:lsdException w:name="Grid Table 1 Light Accent 1" w:uiPriority="46"/>
+    <w:lsdException w:name="Grid Table 2 Accent 1" w:uiPriority="47"/>
+    <w:lsdException w:name="Grid Table 3 Accent 1" w:uiPriority="48"/>
+    <w:lsdException w:name="Grid Table 4 Accent 1" w:uiPriority="49"/>
+    <w:lsdException w:name="Grid Table 5 Dark Accent 1" w:uiPriority="50"/>
+    <w:lsdException w:name="Grid Table 6 Colorful Accent 1" w:uiPriority="51"/>
+    <w:lsdException w:name="Grid Table 7 Colorful Accent 1" w:uiPriority="52"/>
+    <w:lsdException w:name="Grid Table 1 Light Accent 2" w:uiPriority="46"/>
+    <w:lsdException w:name="Grid Table 2 Accent 2" w:uiPriority="47"/>
+    <w:lsdException w:name="Grid Table 3 Accent 2" w:uiPriority="48"/>
+    <w:lsdException w:name="Grid Table 4 Accent 2" w:uiPriority="49"/>
+    <w:lsdException w:name="Grid Table 5 Dark Accent 2" w:uiPriority="50"/>
+    <w:lsdException w:name="Grid Table 6 Colorful Accent 2" w:uiPriority="51"/>
+    <w:lsdException w:name="Grid Table 7 Colorful Accent 2" w:uiPriority="52"/>
+    <w:lsdException w:name="Grid Table 1 Light Accent 3" w:uiPriority="46"/>
+    <w:lsdException w:name="Grid Table 2 Accent 3" w:uiPriority="47"/>
+    <w:lsdException w:name="Grid Table 3 Accent 3" w:uiPriority="48"/>
+    <w:lsdException w:name="Grid Table 4 Accent 3" w:uiPriority="49"/>
+    <w:lsdException w:name="Grid Table 5 Dark Accent 3" w:uiPriority="50"/>
+    <w:lsdException w:name="Grid Table 6 Colorful Accent 3" w:uiPriority="51"/>
+    <w:lsdException w:name="Grid Table 7 Colorful Accent 3" w:uiPriority="52"/>
+    <w:lsdException w:name="Grid Table 1 Light Accent 4" w:uiPriority="46"/>
+    <w:lsdException w:name="Grid Table 2 Accent 4" w:uiPriority="47"/>
+    <w:lsdException w:name="Grid Table 3 Accent 4" w:uiPriority="48"/>
+    <w:lsdException w:name="Grid Table 4 Accent 4" w:uiPriority="49"/>
+    <w:lsdException w:name="Grid Table 5 Dark Accent 4" w:uiPriority="50"/>
+    <w:lsdException w:name="Grid Table 6 Colorful Accent 4" w:uiPriority="51"/>
+    <w:lsdException w:name="Grid Table 7 Colorful Accent 4" w:uiPriority="52"/>
+    <w:lsdException w:name="Grid Table 1 Light Accent 5" w:uiPriority="46"/>
+    <w:lsdException w:name="Grid Table 2 Accent 5" w:uiPriority="47"/>
+    <w:lsdException w:name="Grid Table 3 Accent 5" w:uiPriority="48"/>
+    <w:lsdException w:name="Grid Table 4 Accent 5" w:uiPriority="49"/>
+    <w:lsdException w:name="Grid Table 5 Dark Accent 5" w:uiPriority="50"/>
+    <w:lsdException w:name="Grid Table 6 Colorful Accent 5" w:uiPriority="51"/>
+    <w:lsdException w:name="Grid Table 7 Colorful Accent 5" w:uiPriority="52"/>
+    <w:lsdException w:name="Grid Table 1 Light Accent 6" w:uiPriority="46"/>
+    <w:lsdException w:name="Grid Table 2 Accent 6" w:uiPriority="47"/>
+    <w:lsdException w:name="Grid Table 3 Accent 6" w:uiPriority="48"/>
+    <w:lsdException w:name="Grid Table 4 Accent 6" w:uiPriority="49"/>
+    <w:lsdException w:name="Grid Table 5 Dark Accent 6" w:uiPriority="50"/>
+    <w:lsdException w:name="Grid Table 6 Colorful Accent 6" w:uiPriority="51"/>
+    <w:lsdException w:name="Grid Table 7 Colorful Accent 6" w:uiPriority="52"/>
+    <w:lsdException w:name="List Table 1 Light" w:uiPriority="46"/>
+    <w:lsdException w:name="List Table 2" w:uiPriority="47"/>
+    <w:lsdException w:name="List Table 3" w:uiPriority="48"/>
+    <w:lsdException w:name="List Table 4" w:uiPriority="49"/>
+    <w:lsdException w:name="List Table 5 Dark" w:uiPriority="50"/>
+    <w:lsdException w:name="List Table 6 Colorful" w:uiPriority="51"/>
+    <w:lsdException w:name="List Table 7 Colorful" w:uiPriority="52"/>
+    <w:lsdException w:name="List Table 1 Light Accent 1" w:uiPriority="46"/>
+    <w:lsdException w:name="List Table 2 Accent 1" w:uiPriority="47"/>
+    <w:lsdException w:name="List Table 3 Accent 1" w:uiPriority="48"/>
+    <w:lsdException w:name="List Table 4 Accent 1" w:uiPriority="49"/>
+    <w:lsdException w:name="List Table 5 Dark Accent 1" w:uiPriority="50"/>
+    <w:lsdException w:name="List Table 6 Colorful Accent 1" w:uiPriority="51"/>
+    <w:lsdException w:name="List Table 7 Colorful Accent 1" w:uiPriority="52"/>
+    <w:lsdException w:name="List Table 1 Light Accent 2" w:uiPriority="46"/>
+    <w:lsdException w:name="List Table 2 Accent 2" w:uiPriority="47"/>
+    <w:lsdException w:name="List Table 3 Accent 2" w:uiPriority="48"/>
+    <w:lsdException w:name="List Table 4 Accent 2" w:uiPriority="49"/>
+    <w:lsdException w:name="List Table 5 Dark Accent 2" w:uiPriority="50"/>
+    <w:lsdException w:name="List Table 6 Colorful Accent 2" w:uiPriority="51"/>
+    <w:lsdException w:name="List Table 7 Colorful Accent 2" w:uiPriority="52"/>
+    <w:lsdException w:name="List Table 1 Light Accent 3" w:uiPriority="46"/>
+    <w:lsdException w:name="List Table 2 Accent 3" w:uiPriority="47"/>
+    <w:lsdException w:name="List Table 3 Accent 3" w:uiPriority="48"/>
+    <w:lsdException w:name="List Table 4 Accent 3" w:uiPriority="49"/>
+    <w:lsdException w:name="List Table 5 Dark Accent 3" w:uiPriority="50"/>
+    <w:lsdException w:name="List Table 6 Colorful Accent 3" w:uiPriority="51"/>
+    <w:lsdException w:name="List Table 7 Colorful Accent 3" w:uiPriority="52"/>
+    <w:lsdException w:name="List Table 1 Light Accent 4" w:uiPriority="46"/>
+    <w:lsdException w:name="List Table 2 Accent 4" w:uiPriority="47"/>
+    <w:lsdException w:name="List Table 3 Accent 4" w:uiPriority="48"/>
+    <w:lsdException w:name="List Table 4 Accent 4" w:uiPriority="49"/>
+    <w:lsdException w:name="List Table 5 Dark Accent 4" w:uiPriority="50"/>
+    <w:lsdException w:name="List Table 6 Colorful Accent 4" w:uiPriority="51"/>
+    <w:lsdException w:name="List Table 7 Colorful Accent 4" w:uiPriority="52"/>
+    <w:lsdException w:name="List Table 1 Light Accent 5" w:uiPriority="46"/>
+    <w:lsdException w:name="List Table 2 Accent 5" w:uiPriority="47"/>
+    <w:lsdException w:name="List Table 3 Accent 5" w:uiPriority="48"/>
+    <w:lsdException w:name="List Table 4 Accent 5" w:uiPriority="49"/>
+    <w:lsdException w:name="List Table 5 Dark Accent 5" w:uiPriority="50"/>
+    <w:lsdException w:name="List Table 6 Colorful Accent 5" w:uiPriority="51"/>
+    <w:lsdException w:name="List Table 7 Colorful Accent 5" w:uiPriority="52"/>
+    <w:lsdException w:name="List Table 1 Light Accent 6" w:uiPriority="46"/>
+    <w:lsdException w:name="List Table 2 Accent 6" w:uiPriority="47"/>
+    <w:lsdException w:name="List Table 3 Accent 6" w:uiPriority="48"/>
+    <w:lsdException w:name="List Table 4 Accent 6" w:uiPriority="49"/>
+    <w:lsdException w:name="List Table 5 Dark Accent 6" w:uiPriority="50"/>
+    <w:lsdException w:name="List Table 6 Colorful Accent 6" w:uiPriority="51"/>
+    <w:lsdException w:name="List Table 7 Colorful Accent 6" w:uiPriority="52"/>
   </w:latentStyles>
   <w:style w:type="paragraph" w:default="1" w:styleId="a">
     <w:name w:val="Normal"/>
@@ -8576,7 +9149,6 @@
     <w:uiPriority w:val="99"/>
     <w:semiHidden/>
     <w:unhideWhenUsed/>
-    <w:qFormat/>
     <w:tblPr>
       <w:tblInd w:w="0" w:type="dxa"/>
       <w:tblCellMar>
@@ -8598,7 +9170,6 @@
     <w:basedOn w:val="a1"/>
     <w:rsid w:val="00EF2FDF"/>
     <w:tblPr>
-      <w:tblInd w:w="0" w:type="dxa"/>
       <w:tblBorders>
         <w:top w:val="single" w:sz="4" w:space="0" w:color="auto"/>
         <w:left w:val="single" w:sz="4" w:space="0" w:color="auto"/>
@@ -8607,12 +9178,6 @@
         <w:insideH w:val="single" w:sz="4" w:space="0" w:color="auto"/>
         <w:insideV w:val="single" w:sz="4" w:space="0" w:color="auto"/>
       </w:tblBorders>
-      <w:tblCellMar>
-        <w:top w:w="0" w:type="dxa"/>
-        <w:left w:w="108" w:type="dxa"/>
-        <w:bottom w:w="0" w:type="dxa"/>
-        <w:right w:w="108" w:type="dxa"/>
-      </w:tblCellMar>
     </w:tblPr>
   </w:style>
   <w:style w:type="character" w:customStyle="1" w:styleId="10">
@@ -9072,7 +9637,7 @@
   <a:extraClrSchemeLst/>
   <a:extLst>
     <a:ext uri="{05A4C25C-085E-4340-85A3-A5531E510DB2}">
-      <thm15:themeFamily xmlns:thm15="http://schemas.microsoft.com/office/thememl/2012/main" xmlns="" name="Office Theme" id="{62F939B6-93AF-4DB8-9C6B-D6C7DFDC589F}" vid="{4A3C46E8-61CC-4603-A589-7422A47A8E4A}"/>
+      <thm15:themeFamily xmlns:thm15="http://schemas.microsoft.com/office/thememl/2012/main" name="Office Theme" id="{62F939B6-93AF-4DB8-9C6B-D6C7DFDC589F}" vid="{4A3C46E8-61CC-4603-A589-7422A47A8E4A}"/>
     </a:ext>
   </a:extLst>
 </a:theme>
@@ -9083,7 +9648,7 @@
 </file>
 
 <file path=customXml/itemProps1.xml><?xml version="1.0" encoding="utf-8"?>
-<ds:datastoreItem xmlns:ds="http://schemas.openxmlformats.org/officeDocument/2006/customXml" ds:itemID="{F576AC5A-0F2D-4D78-A68D-B1839BD74976}">
+<ds:datastoreItem xmlns:ds="http://schemas.openxmlformats.org/officeDocument/2006/customXml" ds:itemID="{DDEFC882-174F-4678-975A-926E17C93AE3}">
   <ds:schemaRefs>
     <ds:schemaRef ds:uri="http://schemas.openxmlformats.org/officeDocument/2006/bibliography"/>
   </ds:schemaRefs>

</xml_diff>